<commit_message>
Allow explicit partial coverage digitising tasks
</commit_message>
<xml_diff>
--- a/Writing/Final/Literature Review/RoughWork.docx
+++ b/Writing/Final/Literature Review/RoughWork.docx
@@ -81,9 +81,37 @@
           <w:ilvl w:val="0"/>
           <w:numId w:val="16"/>
         </w:numPr>
-      </w:pPr>
-      <w:r>
-        <w:t>Include Crenian DEEP-PLAST study as context, as related work, what they say for future work and then defence for the thesis.</w:t>
+        <w:rPr>
+          <w:color w:val="FF0000"/>
+        </w:rPr>
+      </w:pPr>
+      <w:proofErr w:type="spellStart"/>
+      <w:r>
+        <w:rPr>
+          <w:color w:val="FF0000"/>
+        </w:rPr>
+        <w:t>Modeling</w:t>
+      </w:r>
+      <w:proofErr w:type="spellEnd"/>
+      <w:r>
+        <w:rPr>
+          <w:color w:val="FF0000"/>
+        </w:rPr>
+        <w:t xml:space="preserve"> the convergence of buoyant debris in the Indian Ocean: Insights from surface drifter trajectories and </w:t>
+      </w:r>
+      <w:proofErr w:type="spellStart"/>
+      <w:r>
+        <w:rPr>
+          <w:color w:val="FF0000"/>
+        </w:rPr>
+        <w:t>Lagrangian</w:t>
+      </w:r>
+      <w:proofErr w:type="spellEnd"/>
+      <w:r>
+        <w:rPr>
+          <w:color w:val="FF0000"/>
+        </w:rPr>
+        <w:t xml:space="preserve"> simulations</w:t>
       </w:r>
     </w:p>
     <w:p>
@@ -95,7 +123,7 @@
         </w:numPr>
       </w:pPr>
       <w:r>
-        <w:t>Look into OPAT for drift model</w:t>
+        <w:t>Include Crenian DEEP-PLAST study as context, as related work, what they say for future work and then defence for the thesis.</w:t>
       </w:r>
     </w:p>
     <w:p>
@@ -107,83 +135,7 @@
         </w:numPr>
       </w:pPr>
       <w:r>
-        <w:t>Look into new variables for the drift model – specifically SMOC</w:t>
-      </w:r>
-      <w:r>
-        <w:t xml:space="preserve"> (Surface merged Ocean Current).</w:t>
-      </w:r>
-      <w:r>
-        <w:t xml:space="preserve"> </w:t>
-      </w:r>
-      <w:r>
-        <w:t>Global Ocean Physics Analysis and Forecast</w:t>
-      </w:r>
-    </w:p>
-    <w:p>
-      <w:pPr>
-        <w:pStyle w:val="ListParagraph"/>
-      </w:pPr>
-    </w:p>
-    <w:p>
-      <w:r>
-        <w:t>Transfer learning (SSL)</w:t>
-      </w:r>
-    </w:p>
-    <w:p>
-      <w:r>
-        <w:t xml:space="preserve"> -</w:t>
-      </w:r>
-      <w:r>
-        <w:t>(</w:t>
-      </w:r>
-      <w:proofErr w:type="spellStart"/>
-      <w:r>
-        <w:t>Yekeen</w:t>
-      </w:r>
-      <w:proofErr w:type="spellEnd"/>
-      <w:r>
-        <w:t xml:space="preserve"> et al., 2020, Zeng and Wang, 2020, Ebrahimi and Sahebi, 2024</w:t>
-      </w:r>
-    </w:p>
-    <w:p>
-      <w:r>
-        <w:t xml:space="preserve"> </w:t>
-      </w:r>
-      <w:proofErr w:type="spellStart"/>
-      <w:r>
-        <w:t>Yekeen</w:t>
-      </w:r>
-      <w:proofErr w:type="spellEnd"/>
-      <w:r>
-        <w:t>, S. T., Balogun, A.-L., Yusof, K. B. W., 2020. A novel deep learning instance segmentation model for automated marine oil spill detection. ISPRS Journal of Photogrammetry and Remote Sensing, 167, 190–200.</w:t>
-      </w:r>
-    </w:p>
-    <w:p>
-      <w:r>
-        <w:t>Zeng, K., Wang, Y., 2020. A deep convolutional neural network for oil spill detection from spaceborne SAR images. Remote Sensing, 12(6), 1015.</w:t>
-      </w:r>
-    </w:p>
-    <w:p>
-      <w:r>
-        <w:t xml:space="preserve">Ebrahimi, M., Sahebi, M. R., 2024. A transfer </w:t>
-      </w:r>
-      <w:proofErr w:type="spellStart"/>
-      <w:r>
-        <w:t>learningDCNN</w:t>
-      </w:r>
-      <w:proofErr w:type="spellEnd"/>
-      <w:r>
-        <w:t xml:space="preserve"> based oil spill detection using compact polarimetric SAR data. Remote Sensing Applications: Society and Environment, 101417.</w:t>
-      </w:r>
-    </w:p>
-    <w:p>
-      <w:pPr>
-        <w:pStyle w:val="ListParagraph"/>
-      </w:pPr>
-    </w:p>
-    <w:p>
-      <w:r>
-        <w:t>Architecture</w:t>
+        <w:t>Look into OPAT for drift model</w:t>
       </w:r>
     </w:p>
     <w:p>
@@ -195,7 +147,83 @@
         </w:numPr>
       </w:pPr>
       <w:r>
-        <w:t xml:space="preserve">Deep Learned features? </w:t>
+        <w:t>Look into new variables for the drift model – specifically SMOC</w:t>
+      </w:r>
+      <w:r>
+        <w:t xml:space="preserve"> (Surface merged Ocean Current).</w:t>
+      </w:r>
+      <w:r>
+        <w:t xml:space="preserve"> </w:t>
+      </w:r>
+      <w:r>
+        <w:t>Global Ocean Physics Analysis and Forecast</w:t>
+      </w:r>
+    </w:p>
+    <w:p>
+      <w:pPr>
+        <w:pStyle w:val="ListParagraph"/>
+      </w:pPr>
+    </w:p>
+    <w:p>
+      <w:r>
+        <w:t>Transfer learning (SSL)</w:t>
+      </w:r>
+    </w:p>
+    <w:p>
+      <w:r>
+        <w:t xml:space="preserve"> -</w:t>
+      </w:r>
+      <w:r>
+        <w:t>(</w:t>
+      </w:r>
+      <w:proofErr w:type="spellStart"/>
+      <w:r>
+        <w:t>Yekeen</w:t>
+      </w:r>
+      <w:proofErr w:type="spellEnd"/>
+      <w:r>
+        <w:t xml:space="preserve"> et al., 2020, Zeng and Wang, 2020, Ebrahimi and Sahebi, 2024</w:t>
+      </w:r>
+    </w:p>
+    <w:p>
+      <w:r>
+        <w:t xml:space="preserve"> </w:t>
+      </w:r>
+      <w:proofErr w:type="spellStart"/>
+      <w:r>
+        <w:t>Yekeen</w:t>
+      </w:r>
+      <w:proofErr w:type="spellEnd"/>
+      <w:r>
+        <w:t>, S. T., Balogun, A.-L., Yusof, K. B. W., 2020. A novel deep learning instance segmentation model for automated marine oil spill detection. ISPRS Journal of Photogrammetry and Remote Sensing, 167, 190–200.</w:t>
+      </w:r>
+    </w:p>
+    <w:p>
+      <w:r>
+        <w:t>Zeng, K., Wang, Y., 2020. A deep convolutional neural network for oil spill detection from spaceborne SAR images. Remote Sensing, 12(6), 1015.</w:t>
+      </w:r>
+    </w:p>
+    <w:p>
+      <w:r>
+        <w:t xml:space="preserve">Ebrahimi, M., Sahebi, M. R., 2024. A transfer </w:t>
+      </w:r>
+      <w:proofErr w:type="spellStart"/>
+      <w:r>
+        <w:t>learningDCNN</w:t>
+      </w:r>
+      <w:proofErr w:type="spellEnd"/>
+      <w:r>
+        <w:t xml:space="preserve"> based oil spill detection using compact polarimetric SAR data. Remote Sensing Applications: Society and Environment, 101417.</w:t>
+      </w:r>
+    </w:p>
+    <w:p>
+      <w:pPr>
+        <w:pStyle w:val="ListParagraph"/>
+      </w:pPr>
+    </w:p>
+    <w:p>
+      <w:r>
+        <w:t>Architecture</w:t>
       </w:r>
     </w:p>
     <w:p>
@@ -207,19 +235,8 @@
         </w:numPr>
       </w:pPr>
       <w:r>
-        <w:t>MARINEXT</w:t>
-      </w:r>
-      <w:r>
-        <w:t xml:space="preserve"> is a model for consideration</w:t>
-      </w:r>
-      <w:r>
-        <w:t>, improved deep learning for marine context</w:t>
-      </w:r>
-    </w:p>
-    <w:p>
-      <w:pPr>
-        <w:pStyle w:val="ListParagraph"/>
-      </w:pPr>
+        <w:t xml:space="preserve">Deep Learned features? </w:t>
+      </w:r>
     </w:p>
     <w:p>
       <w:pPr>
@@ -229,19 +246,12 @@
           <w:numId w:val="16"/>
         </w:numPr>
       </w:pPr>
-      <w:proofErr w:type="spellStart"/>
-      <w:r>
-        <w:t>Superpixel</w:t>
-      </w:r>
-      <w:proofErr w:type="spellEnd"/>
-      <w:r>
-        <w:t xml:space="preserve"> segmentation? </w:t>
-      </w:r>
-    </w:p>
-    <w:p>
-      <w:pPr>
-        <w:pStyle w:val="ListParagraph"/>
-      </w:pPr>
+      <w:r>
+        <w:t>MARINEXT</w:t>
+      </w:r>
+      <w:r>
+        <w:t xml:space="preserve"> is a model for consideration, improved deep learning for marine context</w:t>
+      </w:r>
     </w:p>
     <w:p>
       <w:pPr>
@@ -256,6 +266,33 @@
           <w:numId w:val="16"/>
         </w:numPr>
       </w:pPr>
+      <w:proofErr w:type="spellStart"/>
+      <w:r>
+        <w:t>Superpixel</w:t>
+      </w:r>
+      <w:proofErr w:type="spellEnd"/>
+      <w:r>
+        <w:t xml:space="preserve"> segmentation? </w:t>
+      </w:r>
+    </w:p>
+    <w:p>
+      <w:pPr>
+        <w:pStyle w:val="ListParagraph"/>
+      </w:pPr>
+    </w:p>
+    <w:p>
+      <w:pPr>
+        <w:pStyle w:val="ListParagraph"/>
+      </w:pPr>
+    </w:p>
+    <w:p>
+      <w:pPr>
+        <w:pStyle w:val="ListParagraph"/>
+        <w:numPr>
+          <w:ilvl w:val="0"/>
+          <w:numId w:val="16"/>
+        </w:numPr>
+      </w:pPr>
       <w:r>
         <w:t xml:space="preserve">OPAT as just a reference for the architecture of the project. </w:t>
       </w:r>
@@ -292,10 +329,7 @@
         <w:pStyle w:val="Heading4"/>
       </w:pPr>
       <w:r>
-        <w:t xml:space="preserve">1) </w:t>
-      </w:r>
-      <w:r>
-        <w:t>Detecting Marine Pollutants Using Sentinel-1 SAR and Sentinel-2 Optical Imagery Jason Manesis</w:t>
+        <w:t>1) Detecting Marine Pollutants Using Sentinel-1 SAR and Sentinel-2 Optical Imagery Jason Manesis</w:t>
       </w:r>
     </w:p>
     <w:p>
@@ -897,6 +931,7 @@
         </w:numPr>
       </w:pPr>
       <w:r>
+        <w:lastRenderedPageBreak/>
         <w:t xml:space="preserve">Sentinel-2: </w:t>
       </w:r>
       <w:r>
@@ -975,7 +1010,6 @@
         </w:numPr>
       </w:pPr>
       <w:r>
-        <w:lastRenderedPageBreak/>
         <w:t>UAV: ~</w:t>
       </w:r>
       <w:r>
@@ -1853,12 +1887,12 @@
           <w:b/>
           <w:bCs/>
         </w:rPr>
+        <w:lastRenderedPageBreak/>
         <w:t>4.2 Sentinel-2 semantic segmentation: U-Net vs U-Net++</w:t>
       </w:r>
     </w:p>
     <w:p>
       <w:r>
-        <w:lastRenderedPageBreak/>
         <w:t xml:space="preserve">They trained </w:t>
       </w:r>
       <w:r>
@@ -6619,6 +6653,7 @@
   <w:style w:type="character" w:default="1" w:styleId="DefaultParagraphFont">
     <w:name w:val="Default Paragraph Font"/>
     <w:uiPriority w:val="1"/>
+    <w:semiHidden/>
     <w:unhideWhenUsed/>
   </w:style>
   <w:style w:type="table" w:default="1" w:styleId="TableNormal">

</xml_diff>

<commit_message>
Scenes added, SAR alone Scene handling
</commit_message>
<xml_diff>
--- a/Writing/Final/Literature Review/RoughWork.docx
+++ b/Writing/Final/Literature Review/RoughWork.docx
@@ -1,6 +1,6 @@
 
 <file path=word/document.xml><?xml version="1.0" encoding="utf-8"?>
-<w:document xmlns:wpc="http://schemas.microsoft.com/office/word/2010/wordprocessingCanvas" xmlns:cx="http://schemas.microsoft.com/office/drawing/2014/chartex" xmlns:cx1="http://schemas.microsoft.com/office/drawing/2015/9/8/chartex" xmlns:cx2="http://schemas.microsoft.com/office/drawing/2015/10/21/chartex" xmlns:cx3="http://schemas.microsoft.com/office/drawing/2016/5/9/chartex" xmlns:cx4="http://schemas.microsoft.com/office/drawing/2016/5/10/chartex" xmlns:cx5="http://schemas.microsoft.com/office/drawing/2016/5/11/chartex" xmlns:cx6="http://schemas.microsoft.com/office/drawing/2016/5/12/chartex" xmlns:cx7="http://schemas.microsoft.com/office/drawing/2016/5/13/chartex" xmlns:cx8="http://schemas.microsoft.com/office/drawing/2016/5/14/chartex" xmlns:mc="http://schemas.openxmlformats.org/markup-compatibility/2006" xmlns:aink="http://schemas.microsoft.com/office/drawing/2016/ink" xmlns:am3d="http://schemas.microsoft.com/office/drawing/2017/model3d" xmlns:o="urn:schemas-microsoft-com:office:office" xmlns:oel="http://schemas.microsoft.com/office/2019/extlst" xmlns:r="http://schemas.openxmlformats.org/officeDocument/2006/relationships" xmlns:m="http://schemas.openxmlformats.org/officeDocument/2006/math" xmlns:v="urn:schemas-microsoft-com:vml" xmlns:wp14="http://schemas.microsoft.com/office/word/2010/wordprocessingDrawing" xmlns:wp="http://schemas.openxmlformats.org/drawingml/2006/wordprocessingDrawing" xmlns:w10="urn:schemas-microsoft-com:office:word" xmlns:w="http://schemas.openxmlformats.org/wordprocessingml/2006/main" xmlns:w14="http://schemas.microsoft.com/office/word/2010/wordml" xmlns:w15="http://schemas.microsoft.com/office/word/2012/wordml" xmlns:w16cei="http://schemas.microsoft.com/office/word/2026/wordml/cei" xmlns:w16cex="http://schemas.microsoft.com/office/word/2018/wordml/cex" xmlns:w16cid="http://schemas.microsoft.com/office/word/2016/wordml/cid" xmlns:w16="http://schemas.microsoft.com/office/word/2018/wordml" xmlns:w16du="http://schemas.microsoft.com/office/word/2023/wordml/word16du" xmlns:w16sdtdh="http://schemas.microsoft.com/office/word/2020/wordml/sdtdatahash" xmlns:w16sdtfl="http://schemas.microsoft.com/office/word/2024/wordml/sdtformatlock" xmlns:w16se="http://schemas.microsoft.com/office/word/2015/wordml/symex" xmlns:wpg="http://schemas.microsoft.com/office/word/2010/wordprocessingGroup" xmlns:wpi="http://schemas.microsoft.com/office/word/2010/wordprocessingInk" xmlns:wne="http://schemas.microsoft.com/office/word/2006/wordml" xmlns:wps="http://schemas.microsoft.com/office/word/2010/wordprocessingShape" mc:Ignorable="w14 w15 w16se w16cid w16 w16cex w16sdtdh w16sdtfl w16du wp14">
+<w:document xmlns:wpc="http://schemas.microsoft.com/office/word/2010/wordprocessingCanvas" xmlns:cx="http://schemas.microsoft.com/office/drawing/2014/chartex" xmlns:cx1="http://schemas.microsoft.com/office/drawing/2015/9/8/chartex" xmlns:cx2="http://schemas.microsoft.com/office/drawing/2015/10/21/chartex" xmlns:cx3="http://schemas.microsoft.com/office/drawing/2016/5/9/chartex" xmlns:cx4="http://schemas.microsoft.com/office/drawing/2016/5/10/chartex" xmlns:cx5="http://schemas.microsoft.com/office/drawing/2016/5/11/chartex" xmlns:cx6="http://schemas.microsoft.com/office/drawing/2016/5/12/chartex" xmlns:cx7="http://schemas.microsoft.com/office/drawing/2016/5/13/chartex" xmlns:cx8="http://schemas.microsoft.com/office/drawing/2016/5/14/chartex" xmlns:mc="http://schemas.openxmlformats.org/markup-compatibility/2006" xmlns:aink="http://schemas.microsoft.com/office/drawing/2016/ink" xmlns:am3d="http://schemas.microsoft.com/office/drawing/2017/model3d" xmlns:o="urn:schemas-microsoft-com:office:office" xmlns:oel="http://schemas.microsoft.com/office/2019/extlst" xmlns:r="http://schemas.openxmlformats.org/officeDocument/2006/relationships" xmlns:m="http://schemas.openxmlformats.org/officeDocument/2006/math" xmlns:v="urn:schemas-microsoft-com:vml" xmlns:wp14="http://schemas.microsoft.com/office/word/2010/wordprocessingDrawing" xmlns:wp="http://schemas.openxmlformats.org/drawingml/2006/wordprocessingDrawing" xmlns:w10="urn:schemas-microsoft-com:office:word" xmlns:w="http://schemas.openxmlformats.org/wordprocessingml/2006/main" xmlns:w14="http://schemas.microsoft.com/office/word/2010/wordml" xmlns:w15="http://schemas.microsoft.com/office/word/2012/wordml" xmlns:w16cex="http://schemas.microsoft.com/office/word/2018/wordml/cex" xmlns:w16cid="http://schemas.microsoft.com/office/word/2016/wordml/cid" xmlns:w16="http://schemas.microsoft.com/office/word/2018/wordml" xmlns:w16du="http://schemas.microsoft.com/office/word/2023/wordml/word16du" xmlns:w16sdtdh="http://schemas.microsoft.com/office/word/2020/wordml/sdtdatahash" xmlns:w16sdtfl="http://schemas.microsoft.com/office/word/2024/wordml/sdtformatlock" xmlns:w16se="http://schemas.microsoft.com/office/word/2015/wordml/symex" xmlns:wpg="http://schemas.microsoft.com/office/word/2010/wordprocessingGroup" xmlns:wpi="http://schemas.microsoft.com/office/word/2010/wordprocessingInk" xmlns:wne="http://schemas.microsoft.com/office/word/2006/wordml" xmlns:wps="http://schemas.microsoft.com/office/word/2010/wordprocessingShape" mc:Ignorable="w14 w15 w16se w16cid w16 w16cex w16sdtdh w16sdtfl w16du wp14">
   <w:body>
     <w:p>
       <w:pPr>
@@ -30,6 +30,36 @@
     <w:p>
       <w:r>
         <w:t>Data</w:t>
+      </w:r>
+    </w:p>
+    <w:p>
+      <w:pPr>
+        <w:pStyle w:val="ListParagraph"/>
+        <w:numPr>
+          <w:ilvl w:val="0"/>
+          <w:numId w:val="16"/>
+        </w:numPr>
+      </w:pPr>
+      <w:r>
+        <w:t>New controlled Dataset over Italy left for 18 days 11</w:t>
+      </w:r>
+      <w:r>
+        <w:rPr>
+          <w:vertAlign w:val="superscript"/>
+        </w:rPr>
+        <w:t>th</w:t>
+      </w:r>
+      <w:r>
+        <w:t xml:space="preserve"> April 2025 - </w:t>
+      </w:r>
+      <w:r>
+        <w:t>44.07443° N, 9.83910° E. 44.07437° N, 9.83883° E 44.07431° N, 9.8387</w:t>
+      </w:r>
+      <w:r>
+        <w:t xml:space="preserve"> </w:t>
+      </w:r>
+      <w:r>
+        <w:t>https://www.sciencedirect.com/science/article/pii/S0034425726002634?via%3Dihub</w:t>
       </w:r>
     </w:p>
     <w:p>
@@ -174,6 +204,68 @@
     <w:p>
       <w:pPr>
         <w:pStyle w:val="ListParagraph"/>
+        <w:numPr>
+          <w:ilvl w:val="0"/>
+          <w:numId w:val="16"/>
+        </w:numPr>
+      </w:pPr>
+      <w:r>
+        <w:t>Look at the UMGENI case study</w:t>
+      </w:r>
+    </w:p>
+    <w:p>
+      <w:pPr>
+        <w:pStyle w:val="ListParagraph"/>
+        <w:numPr>
+          <w:ilvl w:val="0"/>
+          <w:numId w:val="16"/>
+        </w:numPr>
+      </w:pPr>
+    </w:p>
+    <w:p>
+      <w:r>
+        <w:t>Method</w:t>
+      </w:r>
+    </w:p>
+    <w:p>
+      <w:pPr>
+        <w:pStyle w:val="ListParagraph"/>
+        <w:numPr>
+          <w:ilvl w:val="0"/>
+          <w:numId w:val="16"/>
+        </w:numPr>
+      </w:pPr>
+      <w:r>
+        <w:t>Need to emphasise on the effects of wind and weather with the biophysical variables</w:t>
+      </w:r>
+    </w:p>
+    <w:p>
+      <w:pPr>
+        <w:pStyle w:val="ListParagraph"/>
+        <w:numPr>
+          <w:ilvl w:val="0"/>
+          <w:numId w:val="16"/>
+        </w:numPr>
+      </w:pPr>
+      <w:r>
+        <w:t>Must make a comment on the size of debris that can be detected with SAR and why – according to our visual identification model for the creation of data.</w:t>
+      </w:r>
+    </w:p>
+    <w:p>
+      <w:pPr>
+        <w:pStyle w:val="ListParagraph"/>
+        <w:numPr>
+          <w:ilvl w:val="0"/>
+          <w:numId w:val="16"/>
+        </w:numPr>
+      </w:pPr>
+      <w:r>
+        <w:t xml:space="preserve">Include a case study that brings together optical, SAR, Drift as a framework for costal detection.  As another deliverable. </w:t>
+      </w:r>
+    </w:p>
+    <w:p>
+      <w:pPr>
+        <w:pStyle w:val="ListParagraph"/>
       </w:pPr>
     </w:p>
     <w:p>
@@ -217,6 +309,7 @@
     </w:p>
     <w:p>
       <w:r>
+        <w:lastRenderedPageBreak/>
         <w:t xml:space="preserve">Ebrahimi, M., Sahebi, M. R., 2024. A transfer </w:t>
       </w:r>
       <w:proofErr w:type="spellStart"/>
@@ -320,37 +413,16 @@
         <w:pStyle w:val="Heading3"/>
       </w:pPr>
       <w:r>
-        <w:lastRenderedPageBreak/>
         <w:t>NOTES on the RATE of dispersion of the plastic waste</w:t>
       </w:r>
     </w:p>
     <w:p>
       <w:r>
-        <w:t xml:space="preserve">Yes. I found several </w:t>
-      </w:r>
-      <w:r>
-        <w:rPr>
-          <w:b/>
-          <w:bCs/>
-        </w:rPr>
-        <w:t>South African studies that support ~0.208 m/s (20.8 cm/s) as a very plausible transport velocity for floating debris</w:t>
-      </w:r>
-      <w:r>
-        <w:t>. Two are particularly useful for your thesis because one documents local surface-current speeds and another explicitly models floating plastic transport.</w:t>
-      </w:r>
-    </w:p>
-    <w:p>
-      <w:pPr>
-        <w:rPr>
-          <w:b/>
-          <w:bCs/>
-        </w:rPr>
-      </w:pPr>
-      <w:r>
-        <w:rPr>
-          <w:b/>
-          <w:bCs/>
-        </w:rPr>
+        <w:t>Yes. I found several South African studies that support ~0.208 m/s (20.8 cm/s) as a very plausible transport velocity for floating debris. Two are particularly useful for your thesis because one documents local surface-current speeds and another explicitly models floating plastic transport.</w:t>
+      </w:r>
+    </w:p>
+    <w:p>
+      <w:r>
         <w:t>1. de Vos, Vichi &amp; Rautenbach (2023) — Table Bay, Cape Town</w:t>
       </w:r>
     </w:p>
@@ -361,17 +433,7 @@
     </w:p>
     <w:p>
       <w:r>
-        <w:t xml:space="preserve">They describe Table Bay circulation and report that </w:t>
-      </w:r>
-      <w:r>
-        <w:rPr>
-          <w:b/>
-          <w:bCs/>
-        </w:rPr>
-        <w:t>typical surface currents reach approximately 0.2–0.3 m/s</w:t>
-      </w:r>
-      <w:r>
-        <w:t xml:space="preserve">. The circulation is predominantly wind-driven, with waves also capable of creating significant near-surface currents. </w:t>
+        <w:t xml:space="preserve">They describe Table Bay circulation and report that typical surface currents reach approximately 0.2–0.3 m/s. The circulation is predominantly wind-driven, with waves also capable of creating significant near-surface currents. </w:t>
       </w:r>
     </w:p>
     <w:p>
@@ -381,10 +443,6 @@
     </w:p>
     <w:p>
       <w:r>
-        <w:rPr>
-          <w:b/>
-          <w:bCs/>
-        </w:rPr>
         <w:t>0.2083 m/s = 0.208 m/s ≈ 20.8 cm/s</w:t>
       </w:r>
     </w:p>
@@ -395,17 +453,7 @@
       </w:r>
       <w:proofErr w:type="gramEnd"/>
       <w:r>
-        <w:t xml:space="preserve"> it sits almost exactly at the lower end of their reported </w:t>
-      </w:r>
-      <w:r>
-        <w:rPr>
-          <w:b/>
-          <w:bCs/>
-        </w:rPr>
-        <w:t>0.2–0.3 m/s</w:t>
-      </w:r>
-      <w:r>
-        <w:t xml:space="preserve"> typical surface-current range.</w:t>
+        <w:t xml:space="preserve"> it sits almost exactly at the lower end of their reported 0.2–0.3 m/s typical surface-current range.</w:t>
       </w:r>
     </w:p>
     <w:p>
@@ -415,10 +463,6 @@
     </w:p>
     <w:p>
       <w:r>
-        <w:rPr>
-          <w:b/>
-          <w:bCs/>
-        </w:rPr>
         <w:t>Harvard reference:</w:t>
       </w:r>
     </w:p>
@@ -445,42 +489,23 @@
     <w:p>
       <w:r>
         <w:pict w14:anchorId="317396F2">
-          <v:rect id="_x0000_i1047" style="width:0;height:1.5pt" o:hralign="center" o:hrstd="t" o:hr="t" fillcolor="#a0a0a0" stroked="f"/>
+          <v:rect id="_x0000_i1025" style="width:0;height:1.5pt" o:hralign="center" o:hrstd="t" o:hr="t" fillcolor="#a0a0a0" stroked="f"/>
         </w:pict>
       </w:r>
     </w:p>
     <w:p>
-      <w:pPr>
-        <w:rPr>
-          <w:b/>
-          <w:bCs/>
-        </w:rPr>
-      </w:pPr>
-      <w:r>
-        <w:rPr>
-          <w:b/>
-          <w:bCs/>
-        </w:rPr>
+      <w:r>
         <w:t>2. Schumann, MacKay &amp; Strydom (2019) — actual floating plastic in South Africa</w:t>
       </w:r>
     </w:p>
     <w:p>
       <w:r>
-        <w:t xml:space="preserve">This one is </w:t>
-      </w:r>
-      <w:r>
-        <w:rPr>
-          <w:b/>
-          <w:bCs/>
-        </w:rPr>
-        <w:t>extremely relevant to you</w:t>
-      </w:r>
-      <w:r>
-        <w:t>.</w:t>
-      </w:r>
-    </w:p>
-    <w:p>
-      <w:r>
+        <w:t>This one is extremely relevant to you.</w:t>
+      </w:r>
+    </w:p>
+    <w:p>
+      <w:r>
+        <w:lastRenderedPageBreak/>
         <w:t>After the 2017 Durban Harbour accident, billions of polyethylene nurdles entered the ocean. The researchers reconstructed their movement along the South African coastline using:</w:t>
       </w:r>
     </w:p>
@@ -541,32 +566,11 @@
     </w:p>
     <w:p>
       <w:r>
-        <w:t xml:space="preserve">They found that the plastics dispersed along </w:t>
-      </w:r>
-      <w:r>
-        <w:rPr>
-          <w:b/>
-          <w:bCs/>
-        </w:rPr>
-        <w:t>~2,000 km of South African coastline in eight weeks</w:t>
-      </w:r>
-      <w:r>
-        <w:t xml:space="preserve">. Importantly, their best explanation of the observed plastic distribution required </w:t>
-      </w:r>
-      <w:r>
-        <w:rPr>
-          <w:b/>
-          <w:bCs/>
-        </w:rPr>
-        <w:t>surface wind-drift velocities equivalent to approximately 5–8% of wind speed</w:t>
-      </w:r>
-      <w:r>
-        <w:t xml:space="preserve">, in addition to the underlying ocean currents. </w:t>
-      </w:r>
-    </w:p>
-    <w:p>
-      <w:r>
-        <w:lastRenderedPageBreak/>
+        <w:t xml:space="preserve">They found that the plastics dispersed along ~2,000 km of South African coastline in eight weeks. Importantly, their best explanation of the observed plastic distribution required surface wind-drift velocities equivalent to approximately 5–8% of wind speed, in addition to the underlying ocean currents. </w:t>
+      </w:r>
+    </w:p>
+    <w:p>
+      <w:r>
         <w:t>They explicitly state that buoyant nurdles are influenced by:</w:t>
       </w:r>
     </w:p>
@@ -766,6 +770,12 @@
             </m:sub>
           </m:sSub>
           <m:r>
+            <m:rPr>
+              <m:sty m:val="p"/>
+            </m:rPr>
+            <w:rPr>
+              <w:rFonts w:ascii="Cambria Math" w:hAnsi="Cambria Math"/>
+            </w:rPr>
             <w:br/>
           </m:r>
         </m:oMath>
@@ -773,42 +783,12 @@
     </w:p>
     <w:p>
       <w:r>
-        <w:t xml:space="preserve">The South African study found </w:t>
-      </w:r>
-      <w:r>
-        <w:rPr>
-          <w:b/>
-          <w:bCs/>
-        </w:rPr>
-        <w:t>5–8% wind drift</w:t>
-      </w:r>
-      <w:r>
-        <w:t xml:space="preserve"> was needed to reproduce observed plastic dispersion. </w:t>
-      </w:r>
-    </w:p>
-    <w:p>
-      <w:r>
-        <w:t xml:space="preserve">For context, a relatively modest </w:t>
-      </w:r>
-      <w:r>
-        <w:rPr>
-          <w:b/>
-          <w:bCs/>
-        </w:rPr>
-        <w:t>4 m/s wind</w:t>
-      </w:r>
-      <w:r>
-        <w:t xml:space="preserve"> would therefore imply approximately </w:t>
-      </w:r>
-      <w:r>
-        <w:rPr>
-          <w:b/>
-          <w:bCs/>
-        </w:rPr>
-        <w:t>0.20–0.32 m/s of wind-related surface drift</w:t>
-      </w:r>
-      <w:r>
-        <w:t xml:space="preserve"> under their 5–8% assumption. </w:t>
+        <w:t xml:space="preserve">The South African study found 5–8% wind drift was needed to reproduce observed plastic dispersion. </w:t>
+      </w:r>
+    </w:p>
+    <w:p>
+      <w:r>
+        <w:t xml:space="preserve">For context, a relatively modest 4 m/s wind would therefore imply approximately 0.20–0.32 m/s of wind-related surface drift under their 5–8% assumption. </w:t>
       </w:r>
       <w:proofErr w:type="gramStart"/>
       <w:r>
@@ -816,25 +796,11 @@
       </w:r>
       <w:proofErr w:type="gramEnd"/>
       <w:r>
-        <w:t xml:space="preserve"> your </w:t>
-      </w:r>
-      <w:r>
-        <w:rPr>
-          <w:b/>
-          <w:bCs/>
-        </w:rPr>
-        <w:t>0.208 m/s is certainly not an extreme number</w:t>
-      </w:r>
-      <w:r>
-        <w:t>.</w:t>
-      </w:r>
-    </w:p>
-    <w:p>
-      <w:r>
-        <w:rPr>
-          <w:b/>
-          <w:bCs/>
-        </w:rPr>
+        <w:t xml:space="preserve"> your 0.208 m/s is certainly not an extreme number.</w:t>
+      </w:r>
+    </w:p>
+    <w:p>
+      <w:r>
         <w:t>Harvard reference:</w:t>
       </w:r>
     </w:p>
@@ -859,17 +825,7 @@
       </w:r>
     </w:p>
     <w:p>
-      <w:pPr>
-        <w:rPr>
-          <w:b/>
-          <w:bCs/>
-        </w:rPr>
-      </w:pPr>
-      <w:r>
-        <w:rPr>
-          <w:b/>
-          <w:bCs/>
-        </w:rPr>
+      <w:r>
         <w:t>3. Collins &amp; Hermes (2019) — modelling plastic transport around South Africa</w:t>
       </w:r>
     </w:p>
@@ -883,55 +839,22 @@
       </w:r>
       <w:proofErr w:type="gramEnd"/>
       <w:r>
-        <w:t xml:space="preserve"> in your thesis because it specifically models </w:t>
-      </w:r>
-      <w:r>
-        <w:rPr>
-          <w:b/>
-          <w:bCs/>
-        </w:rPr>
-        <w:t>floating marine microplastics around South Africa</w:t>
-      </w:r>
-      <w:r>
-        <w:t>.</w:t>
-      </w:r>
-    </w:p>
-    <w:p>
-      <w:r>
-        <w:t xml:space="preserve">Their modelling shows that floating plastics are transported by South Africa's major circulation systems and that particle trajectories depend strongly on the </w:t>
-      </w:r>
-      <w:r>
-        <w:rPr>
-          <w:b/>
-          <w:bCs/>
-        </w:rPr>
-        <w:t>Agulhas and Benguela current systems</w:t>
-      </w:r>
-      <w:r>
-        <w:t xml:space="preserve">, particle properties and coastal circulation. They found transport both offshore into the South Atlantic/Indian Oceans and onto South African beaches. </w:t>
-      </w:r>
-    </w:p>
-    <w:p>
-      <w:r>
-        <w:t xml:space="preserve">It supports the methodological idea you're moving toward: using ocean-current fields to create a </w:t>
-      </w:r>
-      <w:r>
-        <w:rPr>
-          <w:b/>
-          <w:bCs/>
-        </w:rPr>
-        <w:t>possible transport/search region between Sentinel acquisitions</w:t>
-      </w:r>
-      <w:r>
-        <w:t>, rather than looking only at the original optical detection location.</w:t>
-      </w:r>
-    </w:p>
-    <w:p>
-      <w:r>
-        <w:rPr>
-          <w:b/>
-          <w:bCs/>
-        </w:rPr>
+        <w:t xml:space="preserve"> in your thesis because it specifically models floating marine microplastics around South Africa.</w:t>
+      </w:r>
+    </w:p>
+    <w:p>
+      <w:r>
+        <w:t xml:space="preserve">Their modelling shows that floating plastics are transported by South Africa's major circulation systems and that particle trajectories depend strongly on the Agulhas and Benguela current systems, particle properties and coastal circulation. They found transport both offshore into the South Atlantic/Indian Oceans and onto South African beaches. </w:t>
+      </w:r>
+    </w:p>
+    <w:p>
+      <w:r>
+        <w:t>It supports the methodological idea you're moving toward: using ocean-current fields to create a possible transport/search region between Sentinel acquisitions, rather than looking only at the original optical detection location.</w:t>
+      </w:r>
+    </w:p>
+    <w:p>
+      <w:r>
+        <w:lastRenderedPageBreak/>
         <w:t>Harvard reference:</w:t>
       </w:r>
     </w:p>
@@ -956,72 +879,27 @@
       </w:r>
     </w:p>
     <w:p>
-      <w:pPr>
-        <w:rPr>
-          <w:b/>
-          <w:bCs/>
-        </w:rPr>
-      </w:pPr>
-      <w:r>
-        <w:rPr>
-          <w:b/>
-          <w:bCs/>
-        </w:rPr>
+      <w:r>
         <w:t>4. Maclean et al. (2021) — physically released floating objects in SA</w:t>
       </w:r>
     </w:p>
     <w:p>
       <w:r>
-        <w:t xml:space="preserve">This is also useful because they didn't just model particles: they released </w:t>
-      </w:r>
-      <w:r>
-        <w:rPr>
-          <w:b/>
-          <w:bCs/>
-        </w:rPr>
-        <w:t>1,400 marked floating blocks</w:t>
-      </w:r>
-      <w:r>
-        <w:t xml:space="preserve"> with different buoyancies at South African river mouths, including Cape Town and Durban.</w:t>
-      </w:r>
-    </w:p>
-    <w:p>
-      <w:r>
-        <w:t xml:space="preserve">They demonstrated that debris movement and dispersal are controlled by </w:t>
-      </w:r>
-      <w:r>
-        <w:rPr>
-          <w:b/>
-          <w:bCs/>
-        </w:rPr>
-        <w:t>tides, winds, waves and currents</w:t>
-      </w:r>
-      <w:r>
-        <w:t xml:space="preserve">, and that buoyancy substantially changes the resulting trajectory. HDPE objects showed median dispersal distances as high as </w:t>
-      </w:r>
-      <w:r>
-        <w:rPr>
-          <w:b/>
-          <w:bCs/>
-        </w:rPr>
-        <w:t>1,042 m</w:t>
-      </w:r>
-      <w:r>
-        <w:t xml:space="preserve"> at some sites. </w:t>
-      </w:r>
-    </w:p>
-    <w:p>
-      <w:r>
-        <w:lastRenderedPageBreak/>
+        <w:t>This is also useful because they didn't just model particles: they released 1,400 marked floating blocks with different buoyancies at South African river mouths, including Cape Town and Durban.</w:t>
+      </w:r>
+    </w:p>
+    <w:p>
+      <w:r>
+        <w:t xml:space="preserve">They demonstrated that debris movement and dispersal are controlled by tides, winds, waves and currents, and that buoyancy substantially changes the resulting trajectory. HDPE objects showed median dispersal distances as high as 1,042 m at some sites. </w:t>
+      </w:r>
+    </w:p>
+    <w:p>
+      <w:r>
         <w:t>This gives you experimental support for not treating all floating debris as perfect passive water tracers.</w:t>
       </w:r>
     </w:p>
     <w:p>
       <w:r>
-        <w:rPr>
-          <w:b/>
-          <w:bCs/>
-        </w:rPr>
         <w:t>Harvard reference:</w:t>
       </w:r>
     </w:p>
@@ -1041,66 +919,22 @@
       </w:r>
     </w:p>
     <w:p>
-      <w:pPr>
-        <w:rPr>
-          <w:b/>
-          <w:bCs/>
-        </w:rPr>
-      </w:pPr>
-      <w:r>
-        <w:rPr>
-          <w:b/>
-          <w:bCs/>
-        </w:rPr>
+      <w:r>
         <w:t>5. Ryan (2020) — excellent South African review</w:t>
       </w:r>
     </w:p>
     <w:p>
       <w:r>
-        <w:t xml:space="preserve">Ryan's review specifically discusses </w:t>
-      </w:r>
-      <w:r>
-        <w:rPr>
-          <w:b/>
-          <w:bCs/>
-        </w:rPr>
-        <w:t>transport and fate of marine plastics in South Africa</w:t>
-      </w:r>
-      <w:r>
-        <w:t xml:space="preserve">. It notes that floating-plastic trajectories can be estimated using satellite-tracked drifters or oceanographic models and specifically warns that surface plastics can behave differently from subsurface drifters because of </w:t>
-      </w:r>
-      <w:r>
-        <w:rPr>
-          <w:b/>
-          <w:bCs/>
-        </w:rPr>
-        <w:t>Stokes drift, wind and wave effects</w:t>
-      </w:r>
-      <w:r>
-        <w:t xml:space="preserve">. </w:t>
-      </w:r>
-    </w:p>
-    <w:p>
-      <w:r>
-        <w:t xml:space="preserve">It also summarizes evidence that plastics entering South African waters can be exported into both the </w:t>
-      </w:r>
-      <w:r>
-        <w:rPr>
-          <w:b/>
-          <w:bCs/>
-        </w:rPr>
-        <w:t>South Atlantic and Indian Oceans</w:t>
-      </w:r>
-      <w:r>
-        <w:t xml:space="preserve">. </w:t>
-      </w:r>
-    </w:p>
-    <w:p>
-      <w:r>
-        <w:rPr>
-          <w:b/>
-          <w:bCs/>
-        </w:rPr>
+        <w:t xml:space="preserve">Ryan's review specifically discusses transport and fate of marine plastics in South Africa. It notes that floating-plastic trajectories can be estimated using satellite-tracked drifters or oceanographic models and specifically warns that surface plastics can behave differently from subsurface drifters because of Stokes drift, wind and wave effects. </w:t>
+      </w:r>
+    </w:p>
+    <w:p>
+      <w:r>
+        <w:t xml:space="preserve">It also summarizes evidence that plastics entering South African waters can be exported into both the South Atlantic and Indian Oceans. </w:t>
+      </w:r>
+    </w:p>
+    <w:p>
+      <w:r>
         <w:t>Harvard reference:</w:t>
       </w:r>
     </w:p>
@@ -1122,22 +956,12 @@
     <w:p>
       <w:r>
         <w:pict w14:anchorId="3A728965">
-          <v:rect id="_x0000_i1048" style="width:0;height:1.5pt" o:hralign="center" o:hrstd="t" o:hr="t" fillcolor="#a0a0a0" stroked="f"/>
+          <v:rect id="_x0000_i1026" style="width:0;height:1.5pt" o:hralign="center" o:hrstd="t" o:hr="t" fillcolor="#a0a0a0" stroked="f"/>
         </w:pict>
       </w:r>
     </w:p>
     <w:p>
-      <w:pPr>
-        <w:rPr>
-          <w:b/>
-          <w:bCs/>
-        </w:rPr>
-      </w:pPr>
-      <w:r>
-        <w:rPr>
-          <w:b/>
-          <w:bCs/>
-        </w:rPr>
+      <w:r>
         <w:t>What this means for your 0.208 m/s</w:t>
       </w:r>
     </w:p>
@@ -1197,74 +1021,29 @@
     </w:p>
     <w:p>
       <w:r>
-        <w:t xml:space="preserve">That is a </w:t>
-      </w:r>
-      <w:r>
-        <w:rPr>
-          <w:b/>
-          <w:bCs/>
-        </w:rPr>
-        <w:t>much stronger scientific justification</w:t>
-      </w:r>
-      <w:r>
-        <w:t xml:space="preserve"> than simply saying "0.21 m/s seems reasonable."</w:t>
-      </w:r>
-    </w:p>
-    <w:p>
-      <w:r>
-        <w:t xml:space="preserve">One important thing for your SAR annotation work, though: </w:t>
-      </w:r>
-      <w:r>
-        <w:rPr>
-          <w:b/>
-          <w:bCs/>
-        </w:rPr>
-        <w:t>I would not use 0.208 m/s × time as a circular search radius.</w:t>
-      </w:r>
-      <w:r>
-        <w:t xml:space="preserve"> Given this literature, I think your search area should ideally become a </w:t>
-      </w:r>
-      <w:r>
-        <w:rPr>
-          <w:b/>
-          <w:bCs/>
-        </w:rPr>
-        <w:t xml:space="preserve">directional drift envelope based on CMEMS </w:t>
+        <w:lastRenderedPageBreak/>
+        <w:t>That is a much stronger scientific justification than simply saying "0.21 m/s seems reasonable."</w:t>
+      </w:r>
+    </w:p>
+    <w:p>
+      <w:r>
+        <w:t xml:space="preserve">One important thing for your SAR annotation work, though: I would not use 0.208 m/s × time as a circular search radius. Given this literature, I think your search area should ideally become a directional drift envelope based on CMEMS </w:t>
       </w:r>
       <w:proofErr w:type="spellStart"/>
       <w:r>
-        <w:rPr>
-          <w:b/>
-          <w:bCs/>
-        </w:rPr>
         <w:t>uo</w:t>
       </w:r>
       <w:proofErr w:type="spellEnd"/>
       <w:r>
-        <w:rPr>
-          <w:b/>
-          <w:bCs/>
-        </w:rPr>
         <w:t>/</w:t>
       </w:r>
       <w:proofErr w:type="spellStart"/>
       <w:r>
-        <w:rPr>
-          <w:b/>
-          <w:bCs/>
-        </w:rPr>
         <w:t>vo</w:t>
       </w:r>
       <w:proofErr w:type="spellEnd"/>
       <w:r>
-        <w:rPr>
-          <w:b/>
-          <w:bCs/>
-        </w:rPr>
-        <w:t xml:space="preserve"> + ERA5 wind + potentially wave/Stokes information</w:t>
-      </w:r>
-      <w:r>
-        <w:t>, with uncertainty widening through time. That would be considerably more defensible scientifically.</w:t>
+        <w:t xml:space="preserve"> + ERA5 wind + potentially wave/Stokes information, with uncertainty widening through time. That would be considerably more defensible scientifically.</w:t>
       </w:r>
     </w:p>
     <w:p/>
@@ -1312,7 +1091,6 @@
         <w:pStyle w:val="Heading4"/>
       </w:pPr>
       <w:r>
-        <w:lastRenderedPageBreak/>
         <w:t>1) Detecting Marine Pollutants Using Sentinel-1 SAR and Sentinel-2 Optical Imagery Jason Manesis</w:t>
       </w:r>
     </w:p>
@@ -1326,10 +1104,7 @@
         <w:t xml:space="preserve">- </w:t>
       </w:r>
       <w:r>
-        <w:t>MARINEXT</w:t>
-      </w:r>
-      <w:r>
-        <w:t xml:space="preserve"> is a model for consideration</w:t>
+        <w:t>MARINEXT is a model for consideration</w:t>
       </w:r>
     </w:p>
     <w:p>
@@ -1398,38 +1173,19 @@
       </w:r>
       <w:proofErr w:type="spellStart"/>
       <w:r>
-        <w:rPr>
-          <w:b/>
-          <w:bCs/>
-        </w:rPr>
         <w:t>Cernian</w:t>
       </w:r>
       <w:proofErr w:type="spellEnd"/>
       <w:r>
-        <w:rPr>
-          <w:b/>
-          <w:bCs/>
-        </w:rPr>
         <w:t xml:space="preserve"> &amp; </w:t>
       </w:r>
       <w:proofErr w:type="spellStart"/>
       <w:r>
-        <w:rPr>
-          <w:b/>
-          <w:bCs/>
-        </w:rPr>
         <w:t>Iliuţă</w:t>
       </w:r>
       <w:proofErr w:type="spellEnd"/>
       <w:r>
-        <w:rPr>
-          <w:b/>
-          <w:bCs/>
-        </w:rPr>
-        <w:t xml:space="preserve"> (2025)</w:t>
-      </w:r>
-      <w:r>
-        <w:t xml:space="preserve"> </w:t>
+        <w:t xml:space="preserve"> (2025) </w:t>
       </w:r>
       <w:proofErr w:type="gramStart"/>
       <w:r>
@@ -1437,73 +1193,23 @@
       </w:r>
       <w:proofErr w:type="gramEnd"/>
       <w:r>
-        <w:t xml:space="preserve"> in </w:t>
-      </w:r>
-      <w:r>
-        <w:rPr>
-          <w:b/>
-          <w:bCs/>
-        </w:rPr>
-        <w:t>DEEP-PLAST</w:t>
-      </w:r>
-      <w:r>
-        <w:t xml:space="preserve">, followed by </w:t>
-      </w:r>
-      <w:r>
-        <w:rPr>
-          <w:b/>
-          <w:bCs/>
-        </w:rPr>
-        <w:t>lessons learnt</w:t>
-      </w:r>
-      <w:r>
-        <w:t xml:space="preserve"> and </w:t>
-      </w:r>
-      <w:r>
-        <w:rPr>
-          <w:b/>
-          <w:bCs/>
-        </w:rPr>
-        <w:t>directly reusable components</w:t>
-      </w:r>
-      <w:r>
-        <w:t xml:space="preserve"> for your drift-aware cross-sensor labelling and downstream SAR detection work.</w:t>
+        <w:t xml:space="preserve"> in DEEP-PLAST, followed by lessons learnt and directly reusable components for your drift-aware cross-sensor labelling and downstream SAR detection work.</w:t>
       </w:r>
     </w:p>
     <w:p>
       <w:r>
         <w:pict w14:anchorId="537D22C4">
-          <v:rect id="_x0000_i1025" style="width:0;height:1.5pt" o:hralign="center" o:hrstd="t" o:hr="t" fillcolor="#a0a0a0" stroked="f"/>
+          <v:rect id="_x0000_i1027" style="width:0;height:1.5pt" o:hralign="center" o:hrstd="t" o:hr="t" fillcolor="#a0a0a0" stroked="f"/>
         </w:pict>
       </w:r>
     </w:p>
     <w:p>
-      <w:pPr>
-        <w:rPr>
-          <w:b/>
-          <w:bCs/>
-        </w:rPr>
-      </w:pPr>
-      <w:r>
-        <w:rPr>
-          <w:b/>
-          <w:bCs/>
-        </w:rPr>
+      <w:r>
         <w:t>What they did (technical detail from the paper)</w:t>
       </w:r>
     </w:p>
     <w:p>
-      <w:pPr>
-        <w:rPr>
-          <w:b/>
-          <w:bCs/>
-        </w:rPr>
-      </w:pPr>
-      <w:r>
-        <w:rPr>
-          <w:b/>
-          <w:bCs/>
-        </w:rPr>
+      <w:r>
         <w:t>1) Study design and overall system architecture</w:t>
       </w:r>
     </w:p>
@@ -1530,14 +1236,7 @@
         </w:numPr>
       </w:pPr>
       <w:r>
-        <w:rPr>
-          <w:b/>
-          <w:bCs/>
-        </w:rPr>
-        <w:t>High-resolution UAV object detection</w:t>
-      </w:r>
-      <w:r>
-        <w:t xml:space="preserve"> (YOLOv5) to localise plastics at fine scale, and</w:t>
+        <w:t>High-resolution UAV object detection (YOLOv5) to localise plastics at fine scale, and</w:t>
       </w:r>
     </w:p>
     <w:p>
@@ -1548,14 +1247,7 @@
         </w:numPr>
       </w:pPr>
       <w:r>
-        <w:rPr>
-          <w:b/>
-          <w:bCs/>
-        </w:rPr>
-        <w:t>Sentinel-2 semantic segmentation</w:t>
-      </w:r>
-      <w:r>
-        <w:t xml:space="preserve"> (U-Net vs U-Net++) to map plastics at wider scale, and</w:t>
+        <w:t>Sentinel-2 semantic segmentation (U-Net vs U-Net++) to map plastics at wider scale, and</w:t>
       </w:r>
     </w:p>
     <w:p>
@@ -1567,32 +1259,11 @@
       </w:pPr>
       <w:proofErr w:type="spellStart"/>
       <w:r>
-        <w:rPr>
-          <w:b/>
-          <w:bCs/>
-        </w:rPr>
         <w:t>Lagrangian</w:t>
       </w:r>
       <w:proofErr w:type="spellEnd"/>
       <w:r>
-        <w:rPr>
-          <w:b/>
-          <w:bCs/>
-        </w:rPr>
-        <w:t xml:space="preserve"> drift simulation</w:t>
-      </w:r>
-      <w:r>
-        <w:t xml:space="preserve"> driven by operational </w:t>
-      </w:r>
-      <w:r>
-        <w:rPr>
-          <w:b/>
-          <w:bCs/>
-        </w:rPr>
-        <w:t>currents + winds</w:t>
-      </w:r>
-      <w:r>
-        <w:t xml:space="preserve"> to forecast accumulation zones and perform indicative backtracking. (</w:t>
+        <w:t xml:space="preserve"> drift simulation driven by operational currents + winds to forecast accumulation zones and perform indicative backtracking. (</w:t>
       </w:r>
       <w:hyperlink r:id="rId7" w:tooltip="Empowering Sustainability Through AI-Driven Monitoring: The DEEP-PLAST Approach to Marine Plastic Detection and Trajectory Prediction for the Black Sea" w:history="1">
         <w:r>
@@ -1635,35 +1306,18 @@
     <w:p>
       <w:r>
         <w:pict w14:anchorId="02AB9824">
-          <v:rect id="_x0000_i1026" style="width:0;height:1.5pt" o:hralign="center" o:hrstd="t" o:hr="t" fillcolor="#a0a0a0" stroked="f"/>
+          <v:rect id="_x0000_i1028" style="width:0;height:1.5pt" o:hralign="center" o:hrstd="t" o:hr="t" fillcolor="#a0a0a0" stroked="f"/>
         </w:pict>
       </w:r>
     </w:p>
     <w:p>
-      <w:pPr>
-        <w:rPr>
-          <w:b/>
-          <w:bCs/>
-        </w:rPr>
-      </w:pPr>
-      <w:r>
-        <w:rPr>
-          <w:b/>
-          <w:bCs/>
-        </w:rPr>
+      <w:r>
         <w:t>2) Data sources, resolutions, and sampling design</w:t>
       </w:r>
     </w:p>
     <w:p>
       <w:r>
-        <w:rPr>
-          <w:b/>
-          <w:bCs/>
-        </w:rPr>
-        <w:t>Geographic focus:</w:t>
-      </w:r>
-      <w:r>
-        <w:t xml:space="preserve"> Romanian Black Sea coast. (</w:t>
+        <w:t>Geographic focus: Romanian Black Sea coast. (</w:t>
       </w:r>
       <w:hyperlink r:id="rId9" w:tooltip="Empowering Sustainability Through AI-Driven Monitoring: The DEEP-PLAST Approach to Marine Plastic Detection and Trajectory Prediction for the Black Sea" w:history="1">
         <w:r>
@@ -1679,10 +1333,6 @@
     </w:p>
     <w:p>
       <w:r>
-        <w:rPr>
-          <w:b/>
-          <w:bCs/>
-        </w:rPr>
         <w:t>Inputs and spatiotemporal characteristics:</w:t>
       </w:r>
     </w:p>
@@ -1694,34 +1344,7 @@
         </w:numPr>
       </w:pPr>
       <w:r>
-        <w:rPr>
-          <w:b/>
-          <w:bCs/>
-        </w:rPr>
-        <w:t>Sentinel-2 L2A</w:t>
-      </w:r>
-      <w:r>
-        <w:t xml:space="preserve"> scenes (10–20 m) from </w:t>
-      </w:r>
-      <w:r>
-        <w:rPr>
-          <w:b/>
-          <w:bCs/>
-        </w:rPr>
-        <w:t>March–May 2025</w:t>
-      </w:r>
-      <w:r>
-        <w:t xml:space="preserve">, later resampled to </w:t>
-      </w:r>
-      <w:r>
-        <w:rPr>
-          <w:b/>
-          <w:bCs/>
-        </w:rPr>
-        <w:t>10 m</w:t>
-      </w:r>
-      <w:r>
-        <w:t xml:space="preserve"> for modelling. (</w:t>
+        <w:t>Sentinel-2 L2A scenes (10–20 m) from March–May 2025, later resampled to 10 m for modelling. (</w:t>
       </w:r>
       <w:hyperlink r:id="rId10" w:tooltip="Empowering Sustainability Through AI-Driven Monitoring: The DEEP-PLAST Approach to Marine Plastic Detection and Trajectory Prediction for the Black Sea" w:history="1">
         <w:r>
@@ -1743,43 +1366,15 @@
         </w:numPr>
       </w:pPr>
       <w:r>
-        <w:rPr>
-          <w:b/>
-          <w:bCs/>
-        </w:rPr>
         <w:t xml:space="preserve">UAV </w:t>
       </w:r>
       <w:proofErr w:type="spellStart"/>
       <w:r>
-        <w:rPr>
-          <w:b/>
-          <w:bCs/>
-        </w:rPr>
         <w:t>orthomosaics</w:t>
       </w:r>
       <w:proofErr w:type="spellEnd"/>
       <w:r>
-        <w:t xml:space="preserve"> (≈ </w:t>
-      </w:r>
-      <w:r>
-        <w:rPr>
-          <w:b/>
-          <w:bCs/>
-        </w:rPr>
-        <w:t>3 cm</w:t>
-      </w:r>
-      <w:r>
-        <w:t xml:space="preserve"> resolution), collected using a </w:t>
-      </w:r>
-      <w:r>
-        <w:rPr>
-          <w:b/>
-          <w:bCs/>
-        </w:rPr>
-        <w:t>DJI Phantom 4 Pro</w:t>
-      </w:r>
-      <w:r>
-        <w:t>. (</w:t>
+        <w:t xml:space="preserve"> (≈ 3 cm resolution), collected using a DJI Phantom 4 Pro. (</w:t>
       </w:r>
       <w:hyperlink r:id="rId11" w:tooltip="Empowering Sustainability Through AI-Driven Monitoring: The DEEP-PLAST Approach to Marine Plastic Detection and Trajectory Prediction for the Black Sea" w:history="1">
         <w:r>
@@ -1801,34 +1396,8 @@
         </w:numPr>
       </w:pPr>
       <w:r>
-        <w:rPr>
-          <w:b/>
-          <w:bCs/>
-        </w:rPr>
-        <w:t>CMEMS</w:t>
-      </w:r>
-      <w:r>
-        <w:t xml:space="preserve"> surface currents: </w:t>
-      </w:r>
-      <w:r>
-        <w:rPr>
-          <w:b/>
-          <w:bCs/>
-        </w:rPr>
-        <w:t>1/12°</w:t>
-      </w:r>
-      <w:r>
-        <w:t xml:space="preserve">, </w:t>
-      </w:r>
-      <w:r>
-        <w:rPr>
-          <w:b/>
-          <w:bCs/>
-        </w:rPr>
-        <w:t>daily</w:t>
-      </w:r>
-      <w:r>
-        <w:t xml:space="preserve"> u/v fields. (</w:t>
+        <w:lastRenderedPageBreak/>
+        <w:t>CMEMS surface currents: 1/12°, daily u/v fields. (</w:t>
       </w:r>
       <w:hyperlink r:id="rId12" w:tooltip="Empowering Sustainability Through AI-Driven Monitoring: The DEEP-PLAST Approach to Marine Plastic Detection and Trajectory Prediction for the Black Sea" w:history="1">
         <w:r>
@@ -1850,34 +1419,7 @@
         </w:numPr>
       </w:pPr>
       <w:r>
-        <w:rPr>
-          <w:b/>
-          <w:bCs/>
-        </w:rPr>
-        <w:t>NOAA GFS</w:t>
-      </w:r>
-      <w:r>
-        <w:t xml:space="preserve"> winds: </w:t>
-      </w:r>
-      <w:r>
-        <w:rPr>
-          <w:b/>
-          <w:bCs/>
-        </w:rPr>
-        <w:t>0.25°</w:t>
-      </w:r>
-      <w:r>
-        <w:t xml:space="preserve">, </w:t>
-      </w:r>
-      <w:r>
-        <w:rPr>
-          <w:b/>
-          <w:bCs/>
-        </w:rPr>
-        <w:t>6-hourly</w:t>
-      </w:r>
-      <w:r>
-        <w:t xml:space="preserve"> u/v fields. (</w:t>
+        <w:t>NOAA GFS winds: 0.25°, 6-hourly u/v fields. (</w:t>
       </w:r>
       <w:hyperlink r:id="rId13" w:tooltip="Empowering Sustainability Through AI-Driven Monitoring: The DEEP-PLAST Approach to Marine Plastic Detection and Trajectory Prediction for the Black Sea" w:history="1">
         <w:r>
@@ -1893,10 +1435,6 @@
     </w:p>
     <w:p>
       <w:r>
-        <w:rPr>
-          <w:b/>
-          <w:bCs/>
-        </w:rPr>
         <w:t>Dataset structuring (to reduce leakage / spatial autocorrelation):</w:t>
       </w:r>
     </w:p>
@@ -1908,14 +1446,7 @@
         </w:numPr>
       </w:pPr>
       <w:r>
-        <w:rPr>
-          <w:b/>
-          <w:bCs/>
-        </w:rPr>
-        <w:t>Split by scene</w:t>
-      </w:r>
-      <w:r>
-        <w:t>, not random tiles. (</w:t>
+        <w:t>Split by scene, not random tiles. (</w:t>
       </w:r>
       <w:hyperlink r:id="rId14" w:tooltip="Empowering Sustainability Through AI-Driven Monitoring: The DEEP-PLAST Approach to Marine Plastic Detection and Trajectory Prediction for the Black Sea" w:history="1">
         <w:r>
@@ -1937,53 +1468,15 @@
         </w:numPr>
       </w:pPr>
       <w:r>
-        <w:t xml:space="preserve">Sentinel-2: </w:t>
-      </w:r>
-      <w:r>
-        <w:rPr>
-          <w:b/>
-          <w:bCs/>
-        </w:rPr>
-        <w:t>600 chips</w:t>
-      </w:r>
-      <w:r>
-        <w:t xml:space="preserve"> of </w:t>
-      </w:r>
-      <w:r>
-        <w:rPr>
-          <w:b/>
-          <w:bCs/>
-        </w:rPr>
-        <w:t>512×512 px</w:t>
-      </w:r>
-      <w:r>
-        <w:t xml:space="preserve">, split </w:t>
-      </w:r>
-      <w:r>
-        <w:rPr>
-          <w:b/>
-          <w:bCs/>
-        </w:rPr>
-        <w:t xml:space="preserve">360 train / 120 </w:t>
+        <w:t xml:space="preserve">Sentinel-2: 600 chips of 512×512 px, split 360 train / 120 </w:t>
       </w:r>
       <w:proofErr w:type="spellStart"/>
       <w:r>
-        <w:rPr>
-          <w:b/>
-          <w:bCs/>
-        </w:rPr>
         <w:t>val</w:t>
       </w:r>
       <w:proofErr w:type="spellEnd"/>
       <w:r>
-        <w:rPr>
-          <w:b/>
-          <w:bCs/>
-        </w:rPr>
-        <w:t xml:space="preserve"> / 120 test</w:t>
-      </w:r>
-      <w:r>
-        <w:t xml:space="preserve">, with test from </w:t>
+        <w:t xml:space="preserve"> / 120 test, with test from </w:t>
       </w:r>
       <w:r>
         <w:rPr>
@@ -2015,47 +1508,7 @@
         </w:numPr>
       </w:pPr>
       <w:r>
-        <w:t>UAV: ~</w:t>
-      </w:r>
-      <w:r>
-        <w:rPr>
-          <w:b/>
-          <w:bCs/>
-        </w:rPr>
-        <w:t>450 patches</w:t>
-      </w:r>
-      <w:r>
-        <w:t xml:space="preserve">, split </w:t>
-      </w:r>
-      <w:r>
-        <w:rPr>
-          <w:b/>
-          <w:bCs/>
-        </w:rPr>
-        <w:t>60/20/20</w:t>
-      </w:r>
-      <w:r>
-        <w:t xml:space="preserve"> = </w:t>
-      </w:r>
-      <w:r>
-        <w:rPr>
-          <w:b/>
-          <w:bCs/>
-        </w:rPr>
-        <w:t>300/75/75</w:t>
-      </w:r>
-      <w:r>
-        <w:t xml:space="preserve">, with </w:t>
-      </w:r>
-      <w:r>
-        <w:rPr>
-          <w:b/>
-          <w:bCs/>
-        </w:rPr>
-        <w:t>no overlap</w:t>
-      </w:r>
-      <w:r>
-        <w:t xml:space="preserve"> in surveyed area. (</w:t>
+        <w:t>UAV: ~450 patches, split 60/20/20 = 300/75/75, with no overlap in surveyed area. (</w:t>
       </w:r>
       <w:hyperlink r:id="rId16" w:tooltip="Empowering Sustainability Through AI-Driven Monitoring: The DEEP-PLAST Approach to Marine Plastic Detection and Trajectory Prediction for the Black Sea" w:history="1">
         <w:r>
@@ -2071,11 +1524,6 @@
     </w:p>
     <w:p>
       <w:r>
-        <w:rPr>
-          <w:b/>
-          <w:bCs/>
-        </w:rPr>
-        <w:lastRenderedPageBreak/>
         <w:t>Annotations:</w:t>
       </w:r>
     </w:p>
@@ -2087,17 +1535,7 @@
         </w:numPr>
       </w:pPr>
       <w:r>
-        <w:t>UAV: ~</w:t>
-      </w:r>
-      <w:r>
-        <w:rPr>
-          <w:b/>
-          <w:bCs/>
-        </w:rPr>
-        <w:t>3200 bounding boxes</w:t>
-      </w:r>
-      <w:r>
-        <w:t xml:space="preserve"> for plastic objects (YOLO format). (</w:t>
+        <w:t>UAV: ~3200 bounding boxes for plastic objects (YOLO format). (</w:t>
       </w:r>
       <w:hyperlink r:id="rId17" w:tooltip="Empowering Sustainability Through AI-Driven Monitoring: The DEEP-PLAST Approach to Marine Plastic Detection and Trajectory Prediction for the Black Sea" w:history="1">
         <w:r>
@@ -2119,27 +1557,7 @@
         </w:numPr>
       </w:pPr>
       <w:r>
-        <w:t xml:space="preserve">Sentinel-2: </w:t>
-      </w:r>
-      <w:r>
-        <w:rPr>
-          <w:b/>
-          <w:bCs/>
-        </w:rPr>
-        <w:t>140 “positive” chips</w:t>
-      </w:r>
-      <w:r>
-        <w:t xml:space="preserve"> annotated with polygon masks for segmentation; the remaining chips were treated as </w:t>
-      </w:r>
-      <w:r>
-        <w:rPr>
-          <w:b/>
-          <w:bCs/>
-        </w:rPr>
-        <w:t>negatives</w:t>
-      </w:r>
-      <w:r>
-        <w:t xml:space="preserve"> (no detected plastic). (</w:t>
+        <w:t>Sentinel-2: 140 “positive” chips annotated with polygon masks for segmentation; the remaining chips were treated as negatives (no detected plastic). (</w:t>
       </w:r>
       <w:hyperlink r:id="rId18" w:tooltip="Empowering Sustainability Through AI-Driven Monitoring: The DEEP-PLAST Approach to Marine Plastic Detection and Trajectory Prediction for the Black Sea" w:history="1">
         <w:r>
@@ -2156,31 +1574,17 @@
     <w:p>
       <w:r>
         <w:pict w14:anchorId="0BF855E1">
-          <v:rect id="_x0000_i1027" style="width:0;height:1.5pt" o:hralign="center" o:hrstd="t" o:hr="t" fillcolor="#a0a0a0" stroked="f"/>
+          <v:rect id="_x0000_i1029" style="width:0;height:1.5pt" o:hralign="center" o:hrstd="t" o:hr="t" fillcolor="#a0a0a0" stroked="f"/>
         </w:pict>
       </w:r>
     </w:p>
     <w:p>
-      <w:pPr>
-        <w:rPr>
-          <w:b/>
-          <w:bCs/>
-        </w:rPr>
-      </w:pPr>
-      <w:r>
-        <w:rPr>
-          <w:b/>
-          <w:bCs/>
-        </w:rPr>
+      <w:r>
         <w:t>3) Preprocessing (explicit steps)</w:t>
       </w:r>
     </w:p>
     <w:p>
       <w:r>
-        <w:rPr>
-          <w:b/>
-          <w:bCs/>
-        </w:rPr>
         <w:t>Sentinel-2 preprocessing pipeline:</w:t>
       </w:r>
     </w:p>
@@ -2192,27 +1596,7 @@
         </w:numPr>
       </w:pPr>
       <w:r>
-        <w:t xml:space="preserve">Apply </w:t>
-      </w:r>
-      <w:r>
-        <w:rPr>
-          <w:b/>
-          <w:bCs/>
-        </w:rPr>
-        <w:t>SCL (Scene Classification Layer)</w:t>
-      </w:r>
-      <w:r>
-        <w:t xml:space="preserve"> to remove </w:t>
-      </w:r>
-      <w:r>
-        <w:rPr>
-          <w:b/>
-          <w:bCs/>
-        </w:rPr>
-        <w:t>clouds and shadows</w:t>
-      </w:r>
-      <w:r>
-        <w:t>. (</w:t>
+        <w:t>Apply SCL (Scene Classification Layer) to remove clouds and shadows. (</w:t>
       </w:r>
       <w:hyperlink r:id="rId19" w:tooltip="Empowering Sustainability Through AI-Driven Monitoring: The DEEP-PLAST Approach to Marine Plastic Detection and Trajectory Prediction for the Black Sea" w:history="1">
         <w:r>
@@ -2235,32 +1619,11 @@
       </w:pPr>
       <w:proofErr w:type="spellStart"/>
       <w:r>
-        <w:rPr>
-          <w:b/>
-          <w:bCs/>
-        </w:rPr>
         <w:t>Sunglint</w:t>
       </w:r>
       <w:proofErr w:type="spellEnd"/>
       <w:r>
-        <w:rPr>
-          <w:b/>
-          <w:bCs/>
-        </w:rPr>
-        <w:t xml:space="preserve"> correction</w:t>
-      </w:r>
-      <w:r>
-        <w:t xml:space="preserve"> using the </w:t>
-      </w:r>
-      <w:r>
-        <w:rPr>
-          <w:b/>
-          <w:bCs/>
-        </w:rPr>
-        <w:t>Hedley method</w:t>
-      </w:r>
-      <w:r>
-        <w:t>. (</w:t>
+        <w:t xml:space="preserve"> correction using the Hedley method. (</w:t>
       </w:r>
       <w:hyperlink r:id="rId20" w:tooltip="Empowering Sustainability Through AI-Driven Monitoring: The DEEP-PLAST Approach to Marine Plastic Detection and Trajectory Prediction for the Black Sea" w:history="1">
         <w:r>
@@ -2282,27 +1645,7 @@
         </w:numPr>
       </w:pPr>
       <w:r>
-        <w:t xml:space="preserve">Compute </w:t>
-      </w:r>
-      <w:r>
-        <w:rPr>
-          <w:b/>
-          <w:bCs/>
-        </w:rPr>
-        <w:t>NDWI</w:t>
-      </w:r>
-      <w:r>
-        <w:t xml:space="preserve"> to mask </w:t>
-      </w:r>
-      <w:r>
-        <w:rPr>
-          <w:b/>
-          <w:bCs/>
-        </w:rPr>
-        <w:t>non-water</w:t>
-      </w:r>
-      <w:r>
-        <w:t xml:space="preserve"> pixels. (</w:t>
+        <w:t>Compute NDWI to mask non-water pixels. (</w:t>
       </w:r>
       <w:hyperlink r:id="rId21" w:tooltip="Empowering Sustainability Through AI-Driven Monitoring: The DEEP-PLAST Approach to Marine Plastic Detection and Trajectory Prediction for the Black Sea" w:history="1">
         <w:r>
@@ -2324,24 +1667,7 @@
         </w:numPr>
       </w:pPr>
       <w:r>
-        <w:rPr>
-          <w:b/>
-          <w:bCs/>
-        </w:rPr>
-        <w:t>Resample</w:t>
-      </w:r>
-      <w:r>
-        <w:t xml:space="preserve"> all bands to a </w:t>
-      </w:r>
-      <w:r>
-        <w:rPr>
-          <w:b/>
-          <w:bCs/>
-        </w:rPr>
-        <w:t>common 10 m</w:t>
-      </w:r>
-      <w:r>
-        <w:t xml:space="preserve"> grid. (</w:t>
+        <w:t>Resample all bands to a common 10 m grid. (</w:t>
       </w:r>
       <w:hyperlink r:id="rId22" w:tooltip="Empowering Sustainability Through AI-Driven Monitoring: The DEEP-PLAST Approach to Marine Plastic Detection and Trajectory Prediction for the Black Sea" w:history="1">
         <w:r>
@@ -2363,34 +1689,7 @@
         </w:numPr>
       </w:pPr>
       <w:r>
-        <w:rPr>
-          <w:b/>
-          <w:bCs/>
-        </w:rPr>
-        <w:t>Tile</w:t>
-      </w:r>
-      <w:r>
-        <w:t xml:space="preserve"> into </w:t>
-      </w:r>
-      <w:r>
-        <w:rPr>
-          <w:b/>
-          <w:bCs/>
-        </w:rPr>
-        <w:t>512×512</w:t>
-      </w:r>
-      <w:r>
-        <w:t xml:space="preserve"> chips with </w:t>
-      </w:r>
-      <w:r>
-        <w:rPr>
-          <w:b/>
-          <w:bCs/>
-        </w:rPr>
-        <w:t>10% overlap</w:t>
-      </w:r>
-      <w:r>
-        <w:t>. (</w:t>
+        <w:t>Tile into 512×512 chips with 10% overlap. (</w:t>
       </w:r>
       <w:hyperlink r:id="rId23" w:tooltip="Empowering Sustainability Through AI-Driven Monitoring: The DEEP-PLAST Approach to Marine Plastic Detection and Trajectory Prediction for the Black Sea" w:history="1">
         <w:r>
@@ -2406,10 +1705,6 @@
     </w:p>
     <w:p>
       <w:r>
-        <w:rPr>
-          <w:b/>
-          <w:bCs/>
-        </w:rPr>
         <w:t>UAV preprocessing / alignment:</w:t>
       </w:r>
     </w:p>
@@ -2426,17 +1721,7 @@
       </w:r>
       <w:proofErr w:type="spellEnd"/>
       <w:r>
-        <w:t xml:space="preserve"> </w:t>
-      </w:r>
-      <w:r>
-        <w:rPr>
-          <w:b/>
-          <w:bCs/>
-        </w:rPr>
-        <w:t>georeferenced in QGIS</w:t>
-      </w:r>
-      <w:r>
-        <w:t>; non-water (land/vegetation) masked to reduce false detections. (</w:t>
+        <w:t xml:space="preserve"> georeferenced in QGIS; non-water (land/vegetation) masked to reduce false detections. (</w:t>
       </w:r>
       <w:hyperlink r:id="rId24" w:tooltip="Empowering Sustainability Through AI-Driven Monitoring: The DEEP-PLAST Approach to Marine Plastic Detection and Trajectory Prediction for the Black Sea" w:history="1">
         <w:r>
@@ -2480,27 +1765,7 @@
         </w:numPr>
       </w:pPr>
       <w:r>
-        <w:t xml:space="preserve">Flights conducted within </w:t>
-      </w:r>
-      <w:r>
-        <w:rPr>
-          <w:b/>
-          <w:bCs/>
-        </w:rPr>
-        <w:t>±6 hours of Sentinel-2 overpasses</w:t>
-      </w:r>
-      <w:r>
-        <w:t xml:space="preserve"> and </w:t>
-      </w:r>
-      <w:r>
-        <w:rPr>
-          <w:b/>
-          <w:bCs/>
-        </w:rPr>
-        <w:t>co-registered</w:t>
-      </w:r>
-      <w:r>
-        <w:t xml:space="preserve"> to Sentinel-2 tiles. (</w:t>
+        <w:t>Flights conducted within ±6 hours of Sentinel-2 overpasses and co-registered to Sentinel-2 tiles. (</w:t>
       </w:r>
       <w:hyperlink r:id="rId26" w:tooltip="Empowering Sustainability Through AI-Driven Monitoring: The DEEP-PLAST Approach to Marine Plastic Detection and Trajectory Prediction for the Black Sea" w:history="1">
         <w:r>
@@ -2517,69 +1782,31 @@
     <w:p>
       <w:r>
         <w:pict w14:anchorId="51034014">
-          <v:rect id="_x0000_i1028" style="width:0;height:1.5pt" o:hralign="center" o:hrstd="t" o:hr="t" fillcolor="#a0a0a0" stroked="f"/>
+          <v:rect id="_x0000_i1030" style="width:0;height:1.5pt" o:hralign="center" o:hrstd="t" o:hr="t" fillcolor="#a0a0a0" stroked="f"/>
         </w:pict>
       </w:r>
     </w:p>
     <w:p>
-      <w:pPr>
-        <w:rPr>
-          <w:b/>
-          <w:bCs/>
-        </w:rPr>
-      </w:pPr>
-      <w:r>
-        <w:rPr>
-          <w:b/>
-          <w:bCs/>
-        </w:rPr>
+      <w:r>
         <w:t xml:space="preserve">4) Model training configurations (what they </w:t>
       </w:r>
       <w:proofErr w:type="gramStart"/>
       <w:r>
-        <w:rPr>
-          <w:b/>
-          <w:bCs/>
-        </w:rPr>
         <w:t>actually used</w:t>
       </w:r>
       <w:proofErr w:type="gramEnd"/>
       <w:r>
-        <w:rPr>
-          <w:b/>
-          <w:bCs/>
-        </w:rPr>
         <w:t>)</w:t>
       </w:r>
     </w:p>
     <w:p>
-      <w:pPr>
-        <w:rPr>
-          <w:b/>
-          <w:bCs/>
-        </w:rPr>
-      </w:pPr>
-      <w:r>
-        <w:rPr>
-          <w:b/>
-          <w:bCs/>
-        </w:rPr>
+      <w:r>
         <w:t>4.1 UAV object detection: YOLOv5</w:t>
       </w:r>
     </w:p>
     <w:p>
       <w:r>
-        <w:t xml:space="preserve">They fine-tuned </w:t>
-      </w:r>
-      <w:r>
-        <w:rPr>
-          <w:b/>
-          <w:bCs/>
-        </w:rPr>
-        <w:t>YOLOv5s</w:t>
-      </w:r>
-      <w:r>
-        <w:t>:</w:t>
+        <w:t>They fine-tuned YOLOv5s:</w:t>
       </w:r>
     </w:p>
     <w:p>
@@ -2590,17 +1817,7 @@
         </w:numPr>
       </w:pPr>
       <w:r>
-        <w:t xml:space="preserve">Input size: </w:t>
-      </w:r>
-      <w:r>
-        <w:rPr>
-          <w:b/>
-          <w:bCs/>
-        </w:rPr>
-        <w:t>1280×1280</w:t>
-      </w:r>
-      <w:r>
-        <w:t xml:space="preserve"> patches (UAV). (</w:t>
+        <w:t>Input size: 1280×1280 patches (UAV). (</w:t>
       </w:r>
       <w:hyperlink r:id="rId27" w:tooltip="Empowering Sustainability Through AI-Driven Monitoring: The DEEP-PLAST Approach to Marine Plastic Detection and Trajectory Prediction for the Black Sea" w:history="1">
         <w:r>
@@ -2622,17 +1839,7 @@
         </w:numPr>
       </w:pPr>
       <w:r>
-        <w:t xml:space="preserve">Initial weights: </w:t>
-      </w:r>
-      <w:r>
-        <w:rPr>
-          <w:b/>
-          <w:bCs/>
-        </w:rPr>
-        <w:t>COCO pretrained</w:t>
-      </w:r>
-      <w:r>
-        <w:t>. (</w:t>
+        <w:t>Initial weights: COCO pretrained. (</w:t>
       </w:r>
       <w:hyperlink r:id="rId28" w:tooltip="Empowering Sustainability Through AI-Driven Monitoring: The DEEP-PLAST Approach to Marine Plastic Detection and Trajectory Prediction for the Black Sea" w:history="1">
         <w:r>
@@ -2654,52 +1861,16 @@
         </w:numPr>
       </w:pPr>
       <w:r>
-        <w:t xml:space="preserve">Optimiser: </w:t>
-      </w:r>
-      <w:r>
-        <w:rPr>
-          <w:b/>
-          <w:bCs/>
-        </w:rPr>
-        <w:t>SGD</w:t>
-      </w:r>
-      <w:r>
-        <w:t xml:space="preserve"> (momentum </w:t>
-      </w:r>
-      <w:r>
-        <w:rPr>
-          <w:b/>
-          <w:bCs/>
-        </w:rPr>
-        <w:t>0.9</w:t>
-      </w:r>
-      <w:r>
-        <w:t xml:space="preserve">, weight decay </w:t>
-      </w:r>
-      <w:r>
-        <w:rPr>
-          <w:b/>
-          <w:bCs/>
-        </w:rPr>
-        <w:t>5×10</w:t>
+        <w:t>Optimiser: SGD (momentum 0.9, weight decay 5×10</w:t>
       </w:r>
       <w:r>
         <w:rPr>
           <w:rFonts w:ascii="Cambria Math" w:hAnsi="Cambria Math" w:cs="Cambria Math"/>
-          <w:b/>
-          <w:bCs/>
         </w:rPr>
         <w:t>⁻</w:t>
       </w:r>
       <w:r>
-        <w:rPr>
-          <w:b/>
-          <w:bCs/>
-        </w:rPr>
-        <w:t>4</w:t>
-      </w:r>
-      <w:r>
-        <w:t>). (</w:t>
+        <w:t>4). (</w:t>
       </w:r>
       <w:hyperlink r:id="rId29" w:tooltip="Empowering Sustainability Through AI-Driven Monitoring: The DEEP-PLAST Approach to Marine Plastic Detection and Trajectory Prediction for the Black Sea" w:history="1">
         <w:r>
@@ -2721,17 +1892,8 @@
         </w:numPr>
       </w:pPr>
       <w:r>
-        <w:t xml:space="preserve">LR schedule: </w:t>
-      </w:r>
-      <w:r>
-        <w:rPr>
-          <w:b/>
-          <w:bCs/>
-        </w:rPr>
-        <w:t>0.01 cosine</w:t>
-      </w:r>
-      <w:r>
-        <w:t>. (</w:t>
+        <w:lastRenderedPageBreak/>
+        <w:t>LR schedule: 0.01 cosine. (</w:t>
       </w:r>
       <w:hyperlink r:id="rId30" w:tooltip="Empowering Sustainability Through AI-Driven Monitoring: The DEEP-PLAST Approach to Marine Plastic Detection and Trajectory Prediction for the Black Sea" w:history="1">
         <w:r>
@@ -2753,17 +1915,7 @@
         </w:numPr>
       </w:pPr>
       <w:r>
-        <w:t xml:space="preserve">Batch size: </w:t>
-      </w:r>
-      <w:r>
-        <w:rPr>
-          <w:b/>
-          <w:bCs/>
-        </w:rPr>
-        <w:t>16</w:t>
-      </w:r>
-      <w:r>
-        <w:t>. (</w:t>
+        <w:t>Batch size: 16. (</w:t>
       </w:r>
       <w:hyperlink r:id="rId31" w:tooltip="Empowering Sustainability Through AI-Driven Monitoring: The DEEP-PLAST Approach to Marine Plastic Detection and Trajectory Prediction for the Black Sea" w:history="1">
         <w:r>
@@ -2785,37 +1937,7 @@
         </w:numPr>
       </w:pPr>
       <w:r>
-        <w:t xml:space="preserve">Epochs: </w:t>
-      </w:r>
-      <w:r>
-        <w:rPr>
-          <w:b/>
-          <w:bCs/>
-        </w:rPr>
-        <w:t>100</w:t>
-      </w:r>
-      <w:r>
-        <w:t xml:space="preserve">, with </w:t>
-      </w:r>
-      <w:r>
-        <w:rPr>
-          <w:b/>
-          <w:bCs/>
-        </w:rPr>
-        <w:t>early stopping</w:t>
-      </w:r>
-      <w:r>
-        <w:t xml:space="preserve"> (patience </w:t>
-      </w:r>
-      <w:r>
-        <w:rPr>
-          <w:b/>
-          <w:bCs/>
-        </w:rPr>
-        <w:t>10</w:t>
-      </w:r>
-      <w:r>
-        <w:t>). (</w:t>
+        <w:t>Epochs: 100, with early stopping (patience 10). (</w:t>
       </w:r>
       <w:hyperlink r:id="rId32" w:tooltip="Empowering Sustainability Through AI-Driven Monitoring: The DEEP-PLAST Approach to Marine Plastic Detection and Trajectory Prediction for the Black Sea" w:history="1">
         <w:r>
@@ -2837,37 +1959,7 @@
         </w:numPr>
       </w:pPr>
       <w:r>
-        <w:t xml:space="preserve">Augmentations: </w:t>
-      </w:r>
-      <w:r>
-        <w:rPr>
-          <w:b/>
-          <w:bCs/>
-        </w:rPr>
-        <w:t>mosaic</w:t>
-      </w:r>
-      <w:r>
-        <w:t xml:space="preserve">, flips, </w:t>
-      </w:r>
-      <w:r>
-        <w:rPr>
-          <w:b/>
-          <w:bCs/>
-        </w:rPr>
-        <w:t>rotate ±15°</w:t>
-      </w:r>
-      <w:r>
-        <w:t xml:space="preserve">, </w:t>
-      </w:r>
-      <w:r>
-        <w:rPr>
-          <w:b/>
-          <w:bCs/>
-        </w:rPr>
-        <w:t>scale ±10%</w:t>
-      </w:r>
-      <w:r>
-        <w:t>, brightness/contrast. (</w:t>
+        <w:t>Augmentations: mosaic, flips, rotate ±15°, scale ±10%, brightness/contrast. (</w:t>
       </w:r>
       <w:hyperlink r:id="rId33" w:tooltip="Empowering Sustainability Through AI-Driven Monitoring: The DEEP-PLAST Approach to Marine Plastic Detection and Trajectory Prediction for the Black Sea" w:history="1">
         <w:r>
@@ -2882,53 +1974,13 @@
       </w:r>
     </w:p>
     <w:p>
-      <w:pPr>
-        <w:rPr>
-          <w:b/>
-          <w:bCs/>
-        </w:rPr>
-      </w:pPr>
-      <w:r>
-        <w:rPr>
-          <w:b/>
-          <w:bCs/>
-        </w:rPr>
+      <w:r>
         <w:t>4.2 Sentinel-2 semantic segmentation: U-Net vs U-Net++</w:t>
       </w:r>
     </w:p>
     <w:p>
       <w:r>
-        <w:t xml:space="preserve">They trained </w:t>
-      </w:r>
-      <w:r>
-        <w:rPr>
-          <w:b/>
-          <w:bCs/>
-        </w:rPr>
-        <w:t>U-Net</w:t>
-      </w:r>
-      <w:r>
-        <w:t xml:space="preserve"> and </w:t>
-      </w:r>
-      <w:r>
-        <w:rPr>
-          <w:b/>
-          <w:bCs/>
-        </w:rPr>
-        <w:t>U-Net++</w:t>
-      </w:r>
-      <w:r>
-        <w:t xml:space="preserve">, both with </w:t>
-      </w:r>
-      <w:r>
-        <w:rPr>
-          <w:b/>
-          <w:bCs/>
-        </w:rPr>
-        <w:t>ResNet-34 encoders</w:t>
-      </w:r>
-      <w:r>
-        <w:t>:</w:t>
+        <w:t>They trained U-Net and U-Net++, both with ResNet-34 encoders:</w:t>
       </w:r>
     </w:p>
     <w:p>
@@ -2939,17 +1991,7 @@
         </w:numPr>
       </w:pPr>
       <w:r>
-        <w:t xml:space="preserve">Input: </w:t>
-      </w:r>
-      <w:r>
-        <w:rPr>
-          <w:b/>
-          <w:bCs/>
-        </w:rPr>
-        <w:t>512×512</w:t>
-      </w:r>
-      <w:r>
-        <w:t xml:space="preserve"> Sentinel-2 chips. (</w:t>
+        <w:t>Input: 512×512 Sentinel-2 chips. (</w:t>
       </w:r>
       <w:hyperlink r:id="rId34" w:tooltip="Empowering Sustainability Through AI-Driven Monitoring: The DEEP-PLAST Approach to Marine Plastic Detection and Trajectory Prediction for the Black Sea" w:history="1">
         <w:r>
@@ -2971,18 +2013,7 @@
         </w:numPr>
       </w:pPr>
       <w:r>
-        <w:lastRenderedPageBreak/>
-        <w:t xml:space="preserve">Initial weights: </w:t>
-      </w:r>
-      <w:r>
-        <w:rPr>
-          <w:b/>
-          <w:bCs/>
-        </w:rPr>
-        <w:t>ImageNet</w:t>
-      </w:r>
-      <w:r>
-        <w:t xml:space="preserve"> pretrained encoder. (</w:t>
+        <w:t>Initial weights: ImageNet pretrained encoder. (</w:t>
       </w:r>
       <w:hyperlink r:id="rId35" w:tooltip="Empowering Sustainability Through AI-Driven Monitoring: The DEEP-PLAST Approach to Marine Plastic Detection and Trajectory Prediction for the Black Sea" w:history="1">
         <w:r>
@@ -3004,52 +2035,16 @@
         </w:numPr>
       </w:pPr>
       <w:r>
-        <w:t xml:space="preserve">Optimiser: </w:t>
-      </w:r>
-      <w:r>
-        <w:rPr>
-          <w:b/>
-          <w:bCs/>
-        </w:rPr>
-        <w:t>Adam</w:t>
-      </w:r>
-      <w:r>
-        <w:t xml:space="preserve">, LR </w:t>
-      </w:r>
-      <w:r>
-        <w:rPr>
-          <w:b/>
-          <w:bCs/>
-        </w:rPr>
-        <w:t>1×10</w:t>
+        <w:t>Optimiser: Adam, LR 1×10</w:t>
       </w:r>
       <w:r>
         <w:rPr>
           <w:rFonts w:ascii="Cambria Math" w:hAnsi="Cambria Math" w:cs="Cambria Math"/>
-          <w:b/>
-          <w:bCs/>
         </w:rPr>
         <w:t>⁻</w:t>
       </w:r>
       <w:r>
-        <w:rPr>
-          <w:b/>
-          <w:bCs/>
-        </w:rPr>
-        <w:t>3</w:t>
-      </w:r>
-      <w:r>
-        <w:t xml:space="preserve">, </w:t>
-      </w:r>
-      <w:r>
-        <w:rPr>
-          <w:b/>
-          <w:bCs/>
-        </w:rPr>
-        <w:t>polynomial decay (0.9)</w:t>
-      </w:r>
-      <w:r>
-        <w:t>. (</w:t>
+        <w:t>3, polynomial decay (0.9). (</w:t>
       </w:r>
       <w:hyperlink r:id="rId36" w:tooltip="Empowering Sustainability Through AI-Driven Monitoring: The DEEP-PLAST Approach to Marine Plastic Detection and Trajectory Prediction for the Black Sea" w:history="1">
         <w:r>
@@ -3071,27 +2066,7 @@
         </w:numPr>
       </w:pPr>
       <w:r>
-        <w:t xml:space="preserve">Loss: </w:t>
-      </w:r>
-      <w:r>
-        <w:rPr>
-          <w:b/>
-          <w:bCs/>
-        </w:rPr>
-        <w:t>Binary Cross-Entropy + Dice</w:t>
-      </w:r>
-      <w:r>
-        <w:t xml:space="preserve"> to address extreme class imbalance (</w:t>
-      </w:r>
-      <w:r>
-        <w:rPr>
-          <w:b/>
-          <w:bCs/>
-        </w:rPr>
-        <w:t>plastic &lt;1% of pixels</w:t>
-      </w:r>
-      <w:r>
-        <w:t>). (</w:t>
+        <w:t>Loss: Binary Cross-Entropy + Dice to address extreme class imbalance (plastic &lt;1% of pixels). (</w:t>
       </w:r>
       <w:hyperlink r:id="rId37" w:tooltip="Empowering Sustainability Through AI-Driven Monitoring: The DEEP-PLAST Approach to Marine Plastic Detection and Trajectory Prediction for the Black Sea" w:history="1">
         <w:r>
@@ -3113,17 +2088,7 @@
         </w:numPr>
       </w:pPr>
       <w:r>
-        <w:t xml:space="preserve">Batch: </w:t>
-      </w:r>
-      <w:r>
-        <w:rPr>
-          <w:b/>
-          <w:bCs/>
-        </w:rPr>
-        <w:t>8</w:t>
-      </w:r>
-      <w:r>
-        <w:t>. (</w:t>
+        <w:t>Batch: 8. (</w:t>
       </w:r>
       <w:hyperlink r:id="rId38" w:tooltip="Empowering Sustainability Through AI-Driven Monitoring: The DEEP-PLAST Approach to Marine Plastic Detection and Trajectory Prediction for the Black Sea" w:history="1">
         <w:r>
@@ -3145,47 +2110,7 @@
         </w:numPr>
       </w:pPr>
       <w:r>
-        <w:t xml:space="preserve">Epochs: reported as </w:t>
-      </w:r>
-      <w:r>
-        <w:rPr>
-          <w:b/>
-          <w:bCs/>
-        </w:rPr>
-        <w:t>200 with early stopping</w:t>
-      </w:r>
-      <w:r>
-        <w:t xml:space="preserve"> (patience </w:t>
-      </w:r>
-      <w:r>
-        <w:rPr>
-          <w:b/>
-          <w:bCs/>
-        </w:rPr>
-        <w:t>15</w:t>
-      </w:r>
-      <w:r>
-        <w:t>), while noting typical convergence ~</w:t>
-      </w:r>
-      <w:r>
-        <w:rPr>
-          <w:b/>
-          <w:bCs/>
-        </w:rPr>
-        <w:t>40 epochs</w:t>
-      </w:r>
-      <w:r>
-        <w:t xml:space="preserve"> (U-Net) and ~</w:t>
-      </w:r>
-      <w:r>
-        <w:rPr>
-          <w:b/>
-          <w:bCs/>
-        </w:rPr>
-        <w:t>50</w:t>
-      </w:r>
-      <w:r>
-        <w:t xml:space="preserve"> (U-Net++). (</w:t>
+        <w:t>Epochs: reported as 200 with early stopping (patience 15), while noting typical convergence ~40 epochs (U-Net) and ~50 (U-Net++). (</w:t>
       </w:r>
       <w:hyperlink r:id="rId39" w:tooltip="Empowering Sustainability Through AI-Driven Monitoring: The DEEP-PLAST Approach to Marine Plastic Detection and Trajectory Prediction for the Black Sea" w:history="1">
         <w:r>
@@ -3207,17 +2132,7 @@
         </w:numPr>
       </w:pPr>
       <w:r>
-        <w:t xml:space="preserve">Augmentations: flips, </w:t>
-      </w:r>
-      <w:r>
-        <w:rPr>
-          <w:b/>
-          <w:bCs/>
-        </w:rPr>
-        <w:t>90° rotations</w:t>
-      </w:r>
-      <w:r>
-        <w:t>, translation, colour jitter. (</w:t>
+        <w:t>Augmentations: flips, 90° rotations, translation, colour jitter. (</w:t>
       </w:r>
       <w:hyperlink r:id="rId40" w:tooltip="Empowering Sustainability Through AI-Driven Monitoring: The DEEP-PLAST Approach to Marine Plastic Detection and Trajectory Prediction for the Black Sea" w:history="1">
         <w:r>
@@ -3234,31 +2149,17 @@
     <w:p>
       <w:r>
         <w:pict w14:anchorId="04BE179A">
-          <v:rect id="_x0000_i1029" style="width:0;height:1.5pt" o:hralign="center" o:hrstd="t" o:hr="t" fillcolor="#a0a0a0" stroked="f"/>
+          <v:rect id="_x0000_i1031" style="width:0;height:1.5pt" o:hralign="center" o:hrstd="t" o:hr="t" fillcolor="#a0a0a0" stroked="f"/>
         </w:pict>
       </w:r>
     </w:p>
     <w:p>
-      <w:pPr>
-        <w:rPr>
-          <w:b/>
-          <w:bCs/>
-        </w:rPr>
-      </w:pPr>
-      <w:r>
-        <w:rPr>
-          <w:b/>
-          <w:bCs/>
-        </w:rPr>
+      <w:r>
         <w:t>5) Evaluation protocol and reported performance</w:t>
       </w:r>
     </w:p>
     <w:p>
       <w:r>
-        <w:rPr>
-          <w:b/>
-          <w:bCs/>
-        </w:rPr>
         <w:t>Metrics:</w:t>
       </w:r>
     </w:p>
@@ -3274,10 +2175,6 @@
       </w:r>
       <w:proofErr w:type="spellStart"/>
       <w:r>
-        <w:rPr>
-          <w:b/>
-          <w:bCs/>
-        </w:rPr>
         <w:t>IoU</w:t>
       </w:r>
       <w:proofErr w:type="spellEnd"/>
@@ -3308,22 +2205,11 @@
       </w:r>
       <w:proofErr w:type="spellStart"/>
       <w:r>
-        <w:rPr>
-          <w:b/>
-          <w:bCs/>
-        </w:rPr>
         <w:t>IoU</w:t>
       </w:r>
       <w:proofErr w:type="spellEnd"/>
       <w:r>
-        <w:rPr>
-          <w:b/>
-          <w:bCs/>
-        </w:rPr>
-        <w:t xml:space="preserve"> ≥ 0.5</w:t>
-      </w:r>
-      <w:r>
-        <w:t xml:space="preserve"> between predicted and GT boxes. (</w:t>
+        <w:t xml:space="preserve"> ≥ 0.5 between predicted and GT boxes. (</w:t>
       </w:r>
       <w:hyperlink r:id="rId42" w:tooltip="Empowering Sustainability Through AI-Driven Monitoring: The DEEP-PLAST Approach to Marine Plastic Detection and Trajectory Prediction for the Black Sea" w:history="1">
         <w:r>
@@ -3361,10 +2247,6 @@
     </w:p>
     <w:p>
       <w:r>
-        <w:rPr>
-          <w:b/>
-          <w:bCs/>
-        </w:rPr>
         <w:t>Results (test set):</w:t>
       </w:r>
     </w:p>
@@ -3376,56 +2258,15 @@
         </w:numPr>
       </w:pPr>
       <w:r>
-        <w:t xml:space="preserve">YOLOv5 (UAV): </w:t>
-      </w:r>
-      <w:r>
-        <w:rPr>
-          <w:b/>
-          <w:bCs/>
-        </w:rPr>
-        <w:t>Precision 0.910</w:t>
-      </w:r>
-      <w:r>
-        <w:t xml:space="preserve">, </w:t>
-      </w:r>
-      <w:r>
-        <w:rPr>
-          <w:b/>
-          <w:bCs/>
-        </w:rPr>
-        <w:t>Recall 0.880</w:t>
-      </w:r>
-      <w:r>
-        <w:t xml:space="preserve">, </w:t>
-      </w:r>
-      <w:r>
-        <w:rPr>
-          <w:b/>
-          <w:bCs/>
-        </w:rPr>
-        <w:t>F1 0.895</w:t>
-      </w:r>
-      <w:r>
-        <w:t xml:space="preserve">, </w:t>
+        <w:t xml:space="preserve">YOLOv5 (UAV): Precision 0.910, Recall 0.880, F1 0.895, </w:t>
       </w:r>
       <w:proofErr w:type="spellStart"/>
       <w:r>
-        <w:rPr>
-          <w:b/>
-          <w:bCs/>
-        </w:rPr>
         <w:t>IoU</w:t>
       </w:r>
       <w:proofErr w:type="spellEnd"/>
       <w:r>
-        <w:rPr>
-          <w:b/>
-          <w:bCs/>
-        </w:rPr>
-        <w:t xml:space="preserve"> 0.62</w:t>
-      </w:r>
-      <w:r>
-        <w:t>. (</w:t>
+        <w:t xml:space="preserve"> 0.62. (</w:t>
       </w:r>
       <w:hyperlink r:id="rId44" w:tooltip="Empowering Sustainability Through AI-Driven Monitoring: The DEEP-PLAST Approach to Marine Plastic Detection and Trajectory Prediction for the Black Sea" w:history="1">
         <w:r>
@@ -3447,36 +2288,15 @@
         </w:numPr>
       </w:pPr>
       <w:r>
-        <w:t xml:space="preserve">U-Net (S2): </w:t>
-      </w:r>
-      <w:r>
-        <w:rPr>
-          <w:b/>
-          <w:bCs/>
-        </w:rPr>
-        <w:t>F1 0.775</w:t>
-      </w:r>
-      <w:r>
-        <w:t xml:space="preserve">, </w:t>
+        <w:t xml:space="preserve">U-Net (S2): F1 0.775, </w:t>
       </w:r>
       <w:proofErr w:type="spellStart"/>
       <w:r>
-        <w:rPr>
-          <w:b/>
-          <w:bCs/>
-        </w:rPr>
         <w:t>IoU</w:t>
       </w:r>
       <w:proofErr w:type="spellEnd"/>
       <w:r>
-        <w:rPr>
-          <w:b/>
-          <w:bCs/>
-        </w:rPr>
-        <w:t xml:space="preserve"> 0.71</w:t>
-      </w:r>
-      <w:r>
-        <w:t>. (</w:t>
+        <w:t xml:space="preserve"> 0.71. (</w:t>
       </w:r>
       <w:hyperlink r:id="rId45" w:tooltip="Empowering Sustainability Through AI-Driven Monitoring: The DEEP-PLAST Approach to Marine Plastic Detection and Trajectory Prediction for the Black Sea" w:history="1">
         <w:r>
@@ -3498,56 +2318,15 @@
         </w:numPr>
       </w:pPr>
       <w:r>
-        <w:t xml:space="preserve">U-Net++ (S2): </w:t>
-      </w:r>
-      <w:r>
-        <w:rPr>
-          <w:b/>
-          <w:bCs/>
-        </w:rPr>
-        <w:t>Precision 0.850</w:t>
-      </w:r>
-      <w:r>
-        <w:t xml:space="preserve">, </w:t>
-      </w:r>
-      <w:r>
-        <w:rPr>
-          <w:b/>
-          <w:bCs/>
-        </w:rPr>
-        <w:t>Recall 0.830</w:t>
-      </w:r>
-      <w:r>
-        <w:t xml:space="preserve">, </w:t>
-      </w:r>
-      <w:r>
-        <w:rPr>
-          <w:b/>
-          <w:bCs/>
-        </w:rPr>
-        <w:t>F1 0.840</w:t>
-      </w:r>
-      <w:r>
-        <w:t xml:space="preserve">, </w:t>
+        <w:t xml:space="preserve">U-Net++ (S2): Precision 0.850, Recall 0.830, F1 0.840, </w:t>
       </w:r>
       <w:proofErr w:type="spellStart"/>
       <w:r>
-        <w:rPr>
-          <w:b/>
-          <w:bCs/>
-        </w:rPr>
         <w:t>IoU</w:t>
       </w:r>
       <w:proofErr w:type="spellEnd"/>
       <w:r>
-        <w:rPr>
-          <w:b/>
-          <w:bCs/>
-        </w:rPr>
-        <w:t xml:space="preserve"> 0.78</w:t>
-      </w:r>
-      <w:r>
-        <w:t xml:space="preserve"> (best). (</w:t>
+        <w:t xml:space="preserve"> 0.78 (best). (</w:t>
       </w:r>
       <w:hyperlink r:id="rId46" w:tooltip="Empowering Sustainability Through AI-Driven Monitoring: The DEEP-PLAST Approach to Marine Plastic Detection and Trajectory Prediction for the Black Sea" w:history="1">
         <w:r>
@@ -3588,22 +2367,12 @@
     <w:p>
       <w:r>
         <w:pict w14:anchorId="0B9C190F">
-          <v:rect id="_x0000_i1030" style="width:0;height:1.5pt" o:hralign="center" o:hrstd="t" o:hr="t" fillcolor="#a0a0a0" stroked="f"/>
+          <v:rect id="_x0000_i1032" style="width:0;height:1.5pt" o:hralign="center" o:hrstd="t" o:hr="t" fillcolor="#a0a0a0" stroked="f"/>
         </w:pict>
       </w:r>
     </w:p>
     <w:p>
-      <w:pPr>
-        <w:rPr>
-          <w:b/>
-          <w:bCs/>
-        </w:rPr>
-      </w:pPr>
-      <w:r>
-        <w:rPr>
-          <w:b/>
-          <w:bCs/>
-        </w:rPr>
+      <w:r>
         <w:t>6) Trajectory prediction (drift) component</w:t>
       </w:r>
     </w:p>
@@ -3620,17 +2389,7 @@
         </w:numPr>
       </w:pPr>
       <w:r>
-        <w:t xml:space="preserve">Took </w:t>
-      </w:r>
-      <w:r>
-        <w:rPr>
-          <w:b/>
-          <w:bCs/>
-        </w:rPr>
-        <w:t>polygon centroids</w:t>
-      </w:r>
-      <w:r>
-        <w:t xml:space="preserve"> as particle release points. (</w:t>
+        <w:t>Took polygon centroids as particle release points. (</w:t>
       </w:r>
       <w:hyperlink r:id="rId48" w:tooltip="Empowering Sustainability Through AI-Driven Monitoring: The DEEP-PLAST Approach to Marine Plastic Detection and Trajectory Prediction for the Black Sea" w:history="1">
         <w:r>
@@ -3652,36 +2411,16 @@
         </w:numPr>
       </w:pPr>
       <w:r>
+        <w:lastRenderedPageBreak/>
         <w:t xml:space="preserve">Ran a </w:t>
       </w:r>
       <w:proofErr w:type="spellStart"/>
       <w:r>
-        <w:rPr>
-          <w:b/>
-          <w:bCs/>
-        </w:rPr>
         <w:t>Lagrangian</w:t>
       </w:r>
       <w:proofErr w:type="spellEnd"/>
       <w:r>
-        <w:rPr>
-          <w:b/>
-          <w:bCs/>
-        </w:rPr>
-        <w:t xml:space="preserve"> particle drift simulation</w:t>
-      </w:r>
-      <w:r>
-        <w:t xml:space="preserve"> with </w:t>
-      </w:r>
-      <w:r>
-        <w:rPr>
-          <w:b/>
-          <w:bCs/>
-        </w:rPr>
-        <w:t>daily time steps</w:t>
-      </w:r>
-      <w:r>
-        <w:t>. (</w:t>
+        <w:t xml:space="preserve"> particle drift simulation with daily time steps. (</w:t>
       </w:r>
       <w:hyperlink r:id="rId49" w:tooltip="Empowering Sustainability Through AI-Driven Monitoring: The DEEP-PLAST Approach to Marine Plastic Detection and Trajectory Prediction for the Black Sea" w:history="1">
         <w:r>
@@ -3703,27 +2442,7 @@
         </w:numPr>
       </w:pPr>
       <w:r>
-        <w:t xml:space="preserve">Forcing: </w:t>
-      </w:r>
-      <w:r>
-        <w:rPr>
-          <w:b/>
-          <w:bCs/>
-        </w:rPr>
-        <w:t>CMEMS currents + windage</w:t>
-      </w:r>
-      <w:r>
-        <w:t xml:space="preserve"> from </w:t>
-      </w:r>
-      <w:r>
-        <w:rPr>
-          <w:b/>
-          <w:bCs/>
-        </w:rPr>
-        <w:t>NOAA GFS 10 m winds</w:t>
-      </w:r>
-      <w:r>
-        <w:t>, with an effective velocity:</w:t>
+        <w:t>Forcing: CMEMS currents + windage from NOAA GFS 10 m winds, with an effective velocity:</w:t>
       </w:r>
       <w:r>
         <w:br/>
@@ -3761,21 +2480,10 @@
         </w:numPr>
       </w:pPr>
       <w:r>
-        <w:t xml:space="preserve">Numerical integration: </w:t>
-      </w:r>
-      <w:r>
-        <w:rPr>
-          <w:b/>
-          <w:bCs/>
-        </w:rPr>
-        <w:t>Runge–</w:t>
+        <w:t>Numerical integration: Runge–</w:t>
       </w:r>
       <w:proofErr w:type="spellStart"/>
       <w:r>
-        <w:rPr>
-          <w:b/>
-          <w:bCs/>
-        </w:rPr>
         <w:t>Kutta</w:t>
       </w:r>
       <w:proofErr w:type="spellEnd"/>
@@ -3802,7 +2510,6 @@
         </w:numPr>
       </w:pPr>
       <w:r>
-        <w:lastRenderedPageBreak/>
         <w:t>Simulation windows:</w:t>
       </w:r>
     </w:p>
@@ -3814,14 +2521,7 @@
         </w:numPr>
       </w:pPr>
       <w:r>
-        <w:rPr>
-          <w:b/>
-          <w:bCs/>
-        </w:rPr>
-        <w:t>Forward 10 days</w:t>
-      </w:r>
-      <w:r>
-        <w:t xml:space="preserve"> (also described as 5–10 days) for accumulation/stranding zones. (</w:t>
+        <w:t>Forward 10 days (also described as 5–10 days) for accumulation/stranding zones. (</w:t>
       </w:r>
       <w:hyperlink r:id="rId52" w:tooltip="Empowering Sustainability Through AI-Driven Monitoring: The DEEP-PLAST Approach to Marine Plastic Detection and Trajectory Prediction for the Black Sea" w:history="1">
         <w:r>
@@ -3843,14 +2543,7 @@
         </w:numPr>
       </w:pPr>
       <w:r>
-        <w:rPr>
-          <w:b/>
-          <w:bCs/>
-        </w:rPr>
-        <w:t>Backward 10 days</w:t>
-      </w:r>
-      <w:r>
-        <w:t xml:space="preserve"> for indicative source regions. (</w:t>
+        <w:t>Backward 10 days for indicative source regions. (</w:t>
       </w:r>
       <w:hyperlink r:id="rId53" w:tooltip="Empowering Sustainability Through AI-Driven Monitoring: The DEEP-PLAST Approach to Marine Plastic Detection and Trajectory Prediction for the Black Sea" w:history="1">
         <w:r>
@@ -3872,17 +2565,7 @@
         </w:numPr>
       </w:pPr>
       <w:r>
-        <w:t xml:space="preserve">Outputs aggregated into </w:t>
-      </w:r>
-      <w:r>
-        <w:rPr>
-          <w:b/>
-          <w:bCs/>
-        </w:rPr>
-        <w:t>density maps</w:t>
-      </w:r>
-      <w:r>
-        <w:t xml:space="preserve"> for operational targeting. (</w:t>
+        <w:t>Outputs aggregated into density maps for operational targeting. (</w:t>
       </w:r>
       <w:hyperlink r:id="rId54" w:tooltip="Empowering Sustainability Through AI-Driven Monitoring: The DEEP-PLAST Approach to Marine Plastic Detection and Trajectory Prediction for the Black Sea" w:history="1">
         <w:r>
@@ -3898,14 +2581,7 @@
     </w:p>
     <w:p>
       <w:r>
-        <w:rPr>
-          <w:b/>
-          <w:bCs/>
-        </w:rPr>
-        <w:t>Validation of drift was qualitative</w:t>
-      </w:r>
-      <w:r>
-        <w:t>, explicitly limited by lack of consistent ground truth (e.g., in situ tracks, NGO surveys). (</w:t>
+        <w:t>Validation of drift was qualitative, explicitly limited by lack of consistent ground truth (e.g., in situ tracks, NGO surveys). (</w:t>
       </w:r>
       <w:hyperlink r:id="rId55" w:tooltip="Empowering Sustainability Through AI-Driven Monitoring: The DEEP-PLAST Approach to Marine Plastic Detection and Trajectory Prediction for the Black Sea" w:history="1">
         <w:r>
@@ -3922,37 +2598,17 @@
     <w:p>
       <w:r>
         <w:pict w14:anchorId="7E7A0B12">
-          <v:rect id="_x0000_i1031" style="width:0;height:1.5pt" o:hralign="center" o:hrstd="t" o:hr="t" fillcolor="#a0a0a0" stroked="f"/>
+          <v:rect id="_x0000_i1033" style="width:0;height:1.5pt" o:hralign="center" o:hrstd="t" o:hr="t" fillcolor="#a0a0a0" stroked="f"/>
         </w:pict>
       </w:r>
     </w:p>
     <w:p>
-      <w:pPr>
-        <w:rPr>
-          <w:b/>
-          <w:bCs/>
-        </w:rPr>
-      </w:pPr>
-      <w:r>
-        <w:rPr>
-          <w:b/>
-          <w:bCs/>
-        </w:rPr>
+      <w:r>
         <w:t>Lessons learnt (practical implications for your Masters)</w:t>
       </w:r>
     </w:p>
     <w:p>
-      <w:pPr>
-        <w:rPr>
-          <w:b/>
-          <w:bCs/>
-        </w:rPr>
-      </w:pPr>
-      <w:r>
-        <w:rPr>
-          <w:b/>
-          <w:bCs/>
-        </w:rPr>
+      <w:r>
         <w:t>A) Data design: prevent spatial/temporal leakage</w:t>
       </w:r>
     </w:p>
@@ -3983,50 +2639,16 @@
       </w:r>
     </w:p>
     <w:p>
-      <w:pPr>
-        <w:rPr>
-          <w:b/>
-          <w:bCs/>
-        </w:rPr>
-      </w:pPr>
-      <w:r>
-        <w:rPr>
-          <w:b/>
-          <w:bCs/>
-        </w:rPr>
+      <w:r>
         <w:t>B) “Negatives matter” and label imbalance is unavoidable</w:t>
       </w:r>
     </w:p>
     <w:p>
       <w:r>
-        <w:t xml:space="preserve">They explicitly keep many </w:t>
-      </w:r>
-      <w:r>
-        <w:rPr>
-          <w:b/>
-          <w:bCs/>
-        </w:rPr>
-        <w:t>negative Sentinel-2 chips</w:t>
-      </w:r>
-      <w:r>
-        <w:t xml:space="preserve"> (no plastic) and acknowledge plastic pixels are </w:t>
-      </w:r>
-      <w:r>
-        <w:rPr>
-          <w:b/>
-          <w:bCs/>
-        </w:rPr>
-        <w:t>&lt;1%</w:t>
-      </w:r>
-      <w:r>
-        <w:t xml:space="preserve">, then address it with </w:t>
+        <w:t xml:space="preserve">They explicitly keep many negative Sentinel-2 chips (no plastic) and acknowledge plastic pixels are &lt;1%, then address it with </w:t>
       </w:r>
       <w:proofErr w:type="spellStart"/>
       <w:r>
-        <w:rPr>
-          <w:b/>
-          <w:bCs/>
-        </w:rPr>
         <w:t>BCE+Dice</w:t>
       </w:r>
       <w:proofErr w:type="spellEnd"/>
@@ -4046,49 +2668,21 @@
       </w:r>
     </w:p>
     <w:p>
-      <w:pPr>
-        <w:rPr>
-          <w:b/>
-          <w:bCs/>
-        </w:rPr>
-      </w:pPr>
-      <w:r>
-        <w:rPr>
-          <w:b/>
-          <w:bCs/>
-        </w:rPr>
+      <w:r>
         <w:t>C) Preprocessing is not optional in ocean scenes</w:t>
       </w:r>
     </w:p>
     <w:p>
       <w:r>
-        <w:t>Their explicit ordering—</w:t>
-      </w:r>
-      <w:r>
-        <w:rPr>
-          <w:b/>
-          <w:bCs/>
-        </w:rPr>
-        <w:t xml:space="preserve">SCL masking → </w:t>
+        <w:t xml:space="preserve">Their explicit ordering—SCL masking → </w:t>
       </w:r>
       <w:proofErr w:type="spellStart"/>
       <w:r>
-        <w:rPr>
-          <w:b/>
-          <w:bCs/>
-        </w:rPr>
         <w:t>sunglint</w:t>
       </w:r>
       <w:proofErr w:type="spellEnd"/>
       <w:r>
-        <w:rPr>
-          <w:b/>
-          <w:bCs/>
-        </w:rPr>
-        <w:t xml:space="preserve"> correction → NDWI water mask → resample → tiling</w:t>
-      </w:r>
-      <w:r>
-        <w:t>—is a defensible baseline for optical. For your cross-sensor framework, it provides a clean “optical truth candidate” pipeline before any drift-aware label transfer. (</w:t>
+        <w:t xml:space="preserve"> correction → NDWI water mask → resample → tiling—is a defensible baseline for optical. For your cross-sensor framework, it provides a clean “optical truth candidate” pipeline before any drift-aware label transfer. (</w:t>
       </w:r>
       <w:hyperlink r:id="rId58" w:tooltip="Empowering Sustainability Through AI-Driven Monitoring: The DEEP-PLAST Approach to Marine Plastic Detection and Trajectory Prediction for the Black Sea" w:history="1">
         <w:r>
@@ -4103,17 +2697,7 @@
       </w:r>
     </w:p>
     <w:p>
-      <w:pPr>
-        <w:rPr>
-          <w:b/>
-          <w:bCs/>
-        </w:rPr>
-      </w:pPr>
-      <w:r>
-        <w:rPr>
-          <w:b/>
-          <w:bCs/>
-        </w:rPr>
+      <w:r>
         <w:t>D) Drift modelling is useful even when validation is weak—if you are honest about it</w:t>
       </w:r>
     </w:p>
@@ -4142,23 +2726,11 @@
       </w:r>
     </w:p>
     <w:p>
-      <w:pPr>
+      <w:r>
+        <w:t xml:space="preserve">E) The key interface between detection and drift is </w:t>
+      </w:r>
+      <w:r>
         <w:rPr>
-          <w:b/>
-          <w:bCs/>
-        </w:rPr>
-      </w:pPr>
-      <w:r>
-        <w:rPr>
-          <w:b/>
-          <w:bCs/>
-        </w:rPr>
-        <w:t xml:space="preserve">E) The key interface between detection and drift is </w:t>
-      </w:r>
-      <w:r>
-        <w:rPr>
-          <w:b/>
-          <w:bCs/>
           <w:i/>
           <w:iCs/>
         </w:rPr>
@@ -4167,27 +2739,8 @@
     </w:p>
     <w:p>
       <w:r>
-        <w:t xml:space="preserve">They do not drift “pixels”; they drift </w:t>
-      </w:r>
-      <w:r>
-        <w:rPr>
-          <w:b/>
-          <w:bCs/>
-        </w:rPr>
-        <w:t>centroids of detected debris polygons</w:t>
-      </w:r>
-      <w:r>
-        <w:t xml:space="preserve">, then aggregate trajectories into </w:t>
-      </w:r>
-      <w:r>
-        <w:rPr>
-          <w:b/>
-          <w:bCs/>
-        </w:rPr>
-        <w:t>density surfaces</w:t>
-      </w:r>
-      <w:r>
-        <w:t>. This is exactly the kind of interface that can sit between (</w:t>
+        <w:lastRenderedPageBreak/>
+        <w:t>They do not drift “pixels”; they drift centroids of detected debris polygons, then aggregate trajectories into density surfaces. This is exactly the kind of interface that can sit between (</w:t>
       </w:r>
       <w:proofErr w:type="spellStart"/>
       <w:r>
@@ -4212,37 +2765,17 @@
     <w:p>
       <w:r>
         <w:pict w14:anchorId="2B079B57">
-          <v:rect id="_x0000_i1032" style="width:0;height:1.5pt" o:hralign="center" o:hrstd="t" o:hr="t" fillcolor="#a0a0a0" stroked="f"/>
+          <v:rect id="_x0000_i1034" style="width:0;height:1.5pt" o:hralign="center" o:hrstd="t" o:hr="t" fillcolor="#a0a0a0" stroked="f"/>
         </w:pict>
       </w:r>
     </w:p>
     <w:p>
-      <w:pPr>
-        <w:rPr>
-          <w:b/>
-          <w:bCs/>
-        </w:rPr>
-      </w:pPr>
-      <w:r>
-        <w:rPr>
-          <w:b/>
-          <w:bCs/>
-        </w:rPr>
+      <w:r>
         <w:t>What you can reuse directly (methods + data choices)</w:t>
       </w:r>
     </w:p>
     <w:p>
-      <w:pPr>
-        <w:rPr>
-          <w:b/>
-          <w:bCs/>
-        </w:rPr>
-      </w:pPr>
-      <w:r>
-        <w:rPr>
-          <w:b/>
-          <w:bCs/>
-        </w:rPr>
+      <w:r>
         <w:t>1) Directly reusable methodological blocks</w:t>
       </w:r>
     </w:p>
@@ -4254,14 +2787,7 @@
         </w:numPr>
       </w:pPr>
       <w:r>
-        <w:rPr>
-          <w:b/>
-          <w:bCs/>
-        </w:rPr>
-        <w:t>Scene-based splitting</w:t>
-      </w:r>
-      <w:r>
-        <w:t xml:space="preserve"> for Sentinel-2 chips and SAR chips (avoid leakage). (</w:t>
+        <w:t>Scene-based splitting for Sentinel-2 chips and SAR chips (avoid leakage). (</w:t>
       </w:r>
       <w:hyperlink r:id="rId61" w:tooltip="Empowering Sustainability Through AI-Driven Monitoring: The DEEP-PLAST Approach to Marine Plastic Detection and Trajectory Prediction for the Black Sea" w:history="1">
         <w:r>
@@ -4283,14 +2809,7 @@
         </w:numPr>
       </w:pPr>
       <w:r>
-        <w:rPr>
-          <w:b/>
-          <w:bCs/>
-        </w:rPr>
-        <w:t>512×512 tiling with overlap</w:t>
-      </w:r>
-      <w:r>
-        <w:t xml:space="preserve"> (10%)—a workable patching regime for U-Net-family training and inference. (</w:t>
+        <w:t>512×512 tiling with overlap (10%)—a workable patching regime for U-Net-family training and inference. (</w:t>
       </w:r>
       <w:hyperlink r:id="rId62" w:tooltip="Empowering Sustainability Through AI-Driven Monitoring: The DEEP-PLAST Approach to Marine Plastic Detection and Trajectory Prediction for the Black Sea" w:history="1">
         <w:r>
@@ -4312,15 +2831,7 @@
         </w:numPr>
       </w:pPr>
       <w:r>
-        <w:rPr>
-          <w:b/>
-          <w:bCs/>
-        </w:rPr>
-        <w:lastRenderedPageBreak/>
-        <w:t>BCE + Dice loss</w:t>
-      </w:r>
-      <w:r>
-        <w:t xml:space="preserve"> justification for extreme imbalance; keep this as your default for segmentation-style SAR labels too (or adapt to focal/Tversky later). (</w:t>
+        <w:t>BCE + Dice loss justification for extreme imbalance; keep this as your default for segmentation-style SAR labels too (or adapt to focal/Tversky later). (</w:t>
       </w:r>
       <w:hyperlink r:id="rId63" w:tooltip="Empowering Sustainability Through AI-Driven Monitoring: The DEEP-PLAST Approach to Marine Plastic Detection and Trajectory Prediction for the Black Sea" w:history="1">
         <w:r>
@@ -4342,14 +2853,7 @@
         </w:numPr>
       </w:pPr>
       <w:r>
-        <w:rPr>
-          <w:b/>
-          <w:bCs/>
-        </w:rPr>
-        <w:t>Evaluation protocol</w:t>
-      </w:r>
-      <w:r>
-        <w:t>: IoU≥0.5 for detection, per-scene metric aggregation, validation-driven thresholding/early stopping. (</w:t>
+        <w:t>Evaluation protocol: IoU≥0.5 for detection, per-scene metric aggregation, validation-driven thresholding/early stopping. (</w:t>
       </w:r>
       <w:hyperlink r:id="rId64" w:tooltip="Empowering Sustainability Through AI-Driven Monitoring: The DEEP-PLAST Approach to Marine Plastic Detection and Trajectory Prediction for the Black Sea" w:history="1">
         <w:r>
@@ -4371,14 +2875,7 @@
         </w:numPr>
       </w:pPr>
       <w:r>
-        <w:rPr>
-          <w:b/>
-          <w:bCs/>
-        </w:rPr>
-        <w:t>Drift kernel</w:t>
-      </w:r>
-      <w:r>
-        <w:t>: centroid release points; (v=u+\alpha w) with (\alpha=0.03); Runge–</w:t>
+        <w:t>Drift kernel: centroid release points; (v=u+\alpha w) with (\alpha=0.03); Runge–</w:t>
       </w:r>
       <w:proofErr w:type="spellStart"/>
       <w:r>
@@ -4409,43 +2906,13 @@
       </w:r>
     </w:p>
     <w:p>
-      <w:pPr>
-        <w:rPr>
-          <w:b/>
-          <w:bCs/>
-        </w:rPr>
-      </w:pPr>
-      <w:r>
-        <w:rPr>
-          <w:b/>
-          <w:bCs/>
-        </w:rPr>
+      <w:r>
         <w:t>2) Directly reusable forcing datasets for drift (for SA EEZ)</w:t>
       </w:r>
     </w:p>
     <w:p>
       <w:r>
-        <w:t xml:space="preserve">They used </w:t>
-      </w:r>
-      <w:r>
-        <w:rPr>
-          <w:b/>
-          <w:bCs/>
-        </w:rPr>
-        <w:t>CMEMS currents</w:t>
-      </w:r>
-      <w:r>
-        <w:t xml:space="preserve"> + </w:t>
-      </w:r>
-      <w:r>
-        <w:rPr>
-          <w:b/>
-          <w:bCs/>
-        </w:rPr>
-        <w:t>NOAA GFS winds</w:t>
-      </w:r>
-      <w:r>
-        <w:t>. The same classes of products exist for your region (CMEMS is global; GFS is global), making this a drop-in template for your drift-aware label transfer experiments. (</w:t>
+        <w:t>They used CMEMS currents + NOAA GFS winds. The same classes of products exist for your region (CMEMS is global; GFS is global), making this a drop-in template for your drift-aware label transfer experiments. (</w:t>
       </w:r>
       <w:hyperlink r:id="rId66" w:tooltip="Empowering Sustainability Through AI-Driven Monitoring: The DEEP-PLAST Approach to Marine Plastic Detection and Trajectory Prediction for the Black Sea" w:history="1">
         <w:r>
@@ -4460,33 +2927,17 @@
       </w:r>
     </w:p>
     <w:p>
-      <w:pPr>
+      <w:r>
+        <w:t xml:space="preserve">3) What you </w:t>
+      </w:r>
+      <w:r>
         <w:rPr>
-          <w:b/>
-          <w:bCs/>
-        </w:rPr>
-      </w:pPr>
-      <w:r>
-        <w:rPr>
-          <w:b/>
-          <w:bCs/>
-        </w:rPr>
-        <w:t xml:space="preserve">3) What you </w:t>
-      </w:r>
-      <w:r>
-        <w:rPr>
-          <w:b/>
-          <w:bCs/>
           <w:i/>
           <w:iCs/>
         </w:rPr>
         <w:t>cannot</w:t>
       </w:r>
       <w:r>
-        <w:rPr>
-          <w:b/>
-          <w:bCs/>
-        </w:rPr>
         <w:t xml:space="preserve"> directly reuse (and must adapt)</w:t>
       </w:r>
     </w:p>
@@ -4498,17 +2949,7 @@
         </w:numPr>
       </w:pPr>
       <w:r>
-        <w:t xml:space="preserve">Their detector training relies on </w:t>
-      </w:r>
-      <w:r>
-        <w:rPr>
-          <w:b/>
-          <w:bCs/>
-        </w:rPr>
-        <w:t>UAV-derived ground truth</w:t>
-      </w:r>
-      <w:r>
-        <w:t xml:space="preserve"> and co-registration within ±6 hours; if you cannot collect UAV data (or drifter tracks), you will need alternative “strong label” sources (targeted deployments, opportunistic sightings, controlled experiments). (</w:t>
+        <w:t>Their detector training relies on UAV-derived ground truth and co-registration within ±6 hours; if you cannot collect UAV data (or drifter tracks), you will need alternative “strong label” sources (targeted deployments, opportunistic sightings, controlled experiments). (</w:t>
       </w:r>
       <w:hyperlink r:id="rId67" w:tooltip="Empowering Sustainability Through AI-Driven Monitoring: The DEEP-PLAST Approach to Marine Plastic Detection and Trajectory Prediction for the Black Sea" w:history="1">
         <w:r>
@@ -4557,22 +2998,12 @@
     <w:p>
       <w:r>
         <w:pict w14:anchorId="5DDF1E5D">
-          <v:rect id="_x0000_i1033" style="width:0;height:1.5pt" o:hralign="center" o:hrstd="t" o:hr="t" fillcolor="#a0a0a0" stroked="f"/>
+          <v:rect id="_x0000_i1035" style="width:0;height:1.5pt" o:hralign="center" o:hrstd="t" o:hr="t" fillcolor="#a0a0a0" stroked="f"/>
         </w:pict>
       </w:r>
     </w:p>
     <w:p>
-      <w:pPr>
-        <w:rPr>
-          <w:b/>
-          <w:bCs/>
-        </w:rPr>
-      </w:pPr>
-      <w:r>
-        <w:rPr>
-          <w:b/>
-          <w:bCs/>
-        </w:rPr>
+      <w:r>
         <w:t>How this maps onto your drift-aware cross-sensor label transfer objective</w:t>
       </w:r>
     </w:p>
@@ -4589,27 +3020,7 @@
         </w:numPr>
       </w:pPr>
       <w:r>
-        <w:t xml:space="preserve">Run your </w:t>
-      </w:r>
-      <w:r>
-        <w:rPr>
-          <w:b/>
-          <w:bCs/>
-        </w:rPr>
-        <w:t>Sentinel-2 candidate detection</w:t>
-      </w:r>
-      <w:r>
-        <w:t xml:space="preserve"> (thresholding + manual QA, or a segmentation model) to produce </w:t>
-      </w:r>
-      <w:r>
-        <w:rPr>
-          <w:b/>
-          <w:bCs/>
-        </w:rPr>
-        <w:t>polygons</w:t>
-      </w:r>
-      <w:r>
-        <w:t>.</w:t>
+        <w:t>Run your Sentinel-2 candidate detection (thresholding + manual QA, or a segmentation model) to produce polygons.</w:t>
       </w:r>
     </w:p>
     <w:p>
@@ -4620,27 +3031,7 @@
         </w:numPr>
       </w:pPr>
       <w:r>
-        <w:t xml:space="preserve">Use </w:t>
-      </w:r>
-      <w:r>
-        <w:rPr>
-          <w:b/>
-          <w:bCs/>
-        </w:rPr>
-        <w:t>centroids</w:t>
-      </w:r>
-      <w:r>
-        <w:t xml:space="preserve"> as releases and run a </w:t>
-      </w:r>
-      <w:r>
-        <w:rPr>
-          <w:b/>
-          <w:bCs/>
-        </w:rPr>
-        <w:t>forward/backward drift ensemble</w:t>
-      </w:r>
-      <w:r>
-        <w:t xml:space="preserve"> over the S1 acquisition time window (and its uncertainty).</w:t>
+        <w:t>Use centroids as releases and run a forward/backward drift ensemble over the S1 acquisition time window (and its uncertainty).</w:t>
       </w:r>
     </w:p>
     <w:p>
@@ -4651,27 +3042,7 @@
         </w:numPr>
       </w:pPr>
       <w:r>
-        <w:t xml:space="preserve">Rasterise the drifted probability mass onto the </w:t>
-      </w:r>
-      <w:r>
-        <w:rPr>
-          <w:b/>
-          <w:bCs/>
-        </w:rPr>
-        <w:t>Sentinel-1 grid</w:t>
-      </w:r>
-      <w:r>
-        <w:t xml:space="preserve"> to create </w:t>
-      </w:r>
-      <w:r>
-        <w:rPr>
-          <w:b/>
-          <w:bCs/>
-        </w:rPr>
-        <w:t>weak SAR labels</w:t>
-      </w:r>
-      <w:r>
-        <w:t xml:space="preserve"> (your “label transfer under transport uncertainty”).</w:t>
+        <w:t>Rasterise the drifted probability mass onto the Sentinel-1 grid to create weak SAR labels (your “label transfer under transport uncertainty”).</w:t>
       </w:r>
     </w:p>
     <w:p>
@@ -4682,6 +3053,7 @@
         </w:numPr>
       </w:pPr>
       <w:r>
+        <w:lastRenderedPageBreak/>
         <w:t>Keep “weak labels” separate from “strong labels”, and train SAR models with appropriate noise-robust strategies.</w:t>
       </w:r>
     </w:p>
@@ -4722,7 +3094,7 @@
     <w:p>
       <w:r>
         <w:pict w14:anchorId="539CB3BF">
-          <v:rect id="_x0000_i1034" style="width:0;height:1.5pt" o:hralign="center" o:hrstd="t" o:hr="t" fillcolor="#a0a0a0" stroked="f"/>
+          <v:rect id="_x0000_i1036" style="width:0;height:1.5pt" o:hralign="center" o:hrstd="t" o:hr="t" fillcolor="#a0a0a0" stroked="f"/>
         </w:pict>
       </w:r>
     </w:p>
@@ -4802,7 +3174,7 @@
 </file>
 
 <file path=word/numbering.xml><?xml version="1.0" encoding="utf-8"?>
-<w:numbering xmlns:wpc="http://schemas.microsoft.com/office/word/2010/wordprocessingCanvas" xmlns:cx="http://schemas.microsoft.com/office/drawing/2014/chartex" xmlns:cx1="http://schemas.microsoft.com/office/drawing/2015/9/8/chartex" xmlns:cx2="http://schemas.microsoft.com/office/drawing/2015/10/21/chartex" xmlns:cx3="http://schemas.microsoft.com/office/drawing/2016/5/9/chartex" xmlns:cx4="http://schemas.microsoft.com/office/drawing/2016/5/10/chartex" xmlns:cx5="http://schemas.microsoft.com/office/drawing/2016/5/11/chartex" xmlns:cx6="http://schemas.microsoft.com/office/drawing/2016/5/12/chartex" xmlns:cx7="http://schemas.microsoft.com/office/drawing/2016/5/13/chartex" xmlns:cx8="http://schemas.microsoft.com/office/drawing/2016/5/14/chartex" xmlns:mc="http://schemas.openxmlformats.org/markup-compatibility/2006" xmlns:aink="http://schemas.microsoft.com/office/drawing/2016/ink" xmlns:am3d="http://schemas.microsoft.com/office/drawing/2017/model3d" xmlns:o="urn:schemas-microsoft-com:office:office" xmlns:oel="http://schemas.microsoft.com/office/2019/extlst" xmlns:r="http://schemas.openxmlformats.org/officeDocument/2006/relationships" xmlns:m="http://schemas.openxmlformats.org/officeDocument/2006/math" xmlns:v="urn:schemas-microsoft-com:vml" xmlns:wp14="http://schemas.microsoft.com/office/word/2010/wordprocessingDrawing" xmlns:wp="http://schemas.openxmlformats.org/drawingml/2006/wordprocessingDrawing" xmlns:w10="urn:schemas-microsoft-com:office:word" xmlns:w="http://schemas.openxmlformats.org/wordprocessingml/2006/main" xmlns:w14="http://schemas.microsoft.com/office/word/2010/wordml" xmlns:w15="http://schemas.microsoft.com/office/word/2012/wordml" xmlns:w16cei="http://schemas.microsoft.com/office/word/2026/wordml/cei" xmlns:w16cex="http://schemas.microsoft.com/office/word/2018/wordml/cex" xmlns:w16cid="http://schemas.microsoft.com/office/word/2016/wordml/cid" xmlns:w16="http://schemas.microsoft.com/office/word/2018/wordml" xmlns:w16du="http://schemas.microsoft.com/office/word/2023/wordml/word16du" xmlns:w16sdtdh="http://schemas.microsoft.com/office/word/2020/wordml/sdtdatahash" xmlns:w16sdtfl="http://schemas.microsoft.com/office/word/2024/wordml/sdtformatlock" xmlns:w16se="http://schemas.microsoft.com/office/word/2015/wordml/symex" xmlns:wpg="http://schemas.microsoft.com/office/word/2010/wordprocessingGroup" xmlns:wpi="http://schemas.microsoft.com/office/word/2010/wordprocessingInk" xmlns:wne="http://schemas.microsoft.com/office/word/2006/wordml" xmlns:wps="http://schemas.microsoft.com/office/word/2010/wordprocessingShape" mc:Ignorable="w14 w15 w16se w16cid w16 w16cex w16sdtdh w16sdtfl w16du wp14">
+<w:numbering xmlns:wpc="http://schemas.microsoft.com/office/word/2010/wordprocessingCanvas" xmlns:cx="http://schemas.microsoft.com/office/drawing/2014/chartex" xmlns:cx1="http://schemas.microsoft.com/office/drawing/2015/9/8/chartex" xmlns:cx2="http://schemas.microsoft.com/office/drawing/2015/10/21/chartex" xmlns:cx3="http://schemas.microsoft.com/office/drawing/2016/5/9/chartex" xmlns:cx4="http://schemas.microsoft.com/office/drawing/2016/5/10/chartex" xmlns:cx5="http://schemas.microsoft.com/office/drawing/2016/5/11/chartex" xmlns:cx6="http://schemas.microsoft.com/office/drawing/2016/5/12/chartex" xmlns:cx7="http://schemas.microsoft.com/office/drawing/2016/5/13/chartex" xmlns:cx8="http://schemas.microsoft.com/office/drawing/2016/5/14/chartex" xmlns:mc="http://schemas.openxmlformats.org/markup-compatibility/2006" xmlns:aink="http://schemas.microsoft.com/office/drawing/2016/ink" xmlns:am3d="http://schemas.microsoft.com/office/drawing/2017/model3d" xmlns:o="urn:schemas-microsoft-com:office:office" xmlns:oel="http://schemas.microsoft.com/office/2019/extlst" xmlns:r="http://schemas.openxmlformats.org/officeDocument/2006/relationships" xmlns:m="http://schemas.openxmlformats.org/officeDocument/2006/math" xmlns:v="urn:schemas-microsoft-com:vml" xmlns:wp14="http://schemas.microsoft.com/office/word/2010/wordprocessingDrawing" xmlns:wp="http://schemas.openxmlformats.org/drawingml/2006/wordprocessingDrawing" xmlns:w10="urn:schemas-microsoft-com:office:word" xmlns:w="http://schemas.openxmlformats.org/wordprocessingml/2006/main" xmlns:w14="http://schemas.microsoft.com/office/word/2010/wordml" xmlns:w15="http://schemas.microsoft.com/office/word/2012/wordml" xmlns:w16cex="http://schemas.microsoft.com/office/word/2018/wordml/cex" xmlns:w16cid="http://schemas.microsoft.com/office/word/2016/wordml/cid" xmlns:w16="http://schemas.microsoft.com/office/word/2018/wordml" xmlns:w16du="http://schemas.microsoft.com/office/word/2023/wordml/word16du" xmlns:w16sdtdh="http://schemas.microsoft.com/office/word/2020/wordml/sdtdatahash" xmlns:w16sdtfl="http://schemas.microsoft.com/office/word/2024/wordml/sdtformatlock" xmlns:w16se="http://schemas.microsoft.com/office/word/2015/wordml/symex" xmlns:wpg="http://schemas.microsoft.com/office/word/2010/wordprocessingGroup" xmlns:wpi="http://schemas.microsoft.com/office/word/2010/wordprocessingInk" xmlns:wne="http://schemas.microsoft.com/office/word/2006/wordml" xmlns:wps="http://schemas.microsoft.com/office/word/2010/wordprocessingShape" mc:Ignorable="w14 w15 w16se w16cid w16 w16cex w16sdtdh w16sdtfl w16du wp14">
   <w:abstractNum w:abstractNumId="0" w15:restartNumberingAfterBreak="0">
     <w:nsid w:val="035A4B4C"/>
     <w:multiLevelType w:val="multilevel"/>

</xml_diff>